<commit_message>
Add Source Document No. column and update report layout for CRO Fiscal Bill (#10075)
</commit_message>
<xml_diff>
--- a/Application/src/_Reports/layouts/CROFiscalBillA4.docx
+++ b/Application/src/_Reports/layouts/CROFiscalBillA4.docx
@@ -7,12 +7,12 @@
         <w:tblStyle w:val="TableGrid"/>
         <w:tblW w:w="0" w:type="auto"/>
         <w:tblBorders>
-          <w:top w:val="none" w:sz="0" w:space="0" w:color="auto"/>
-          <w:left w:val="none" w:sz="0" w:space="0" w:color="auto"/>
-          <w:bottom w:val="none" w:sz="0" w:space="0" w:color="auto"/>
-          <w:right w:val="none" w:sz="0" w:space="0" w:color="auto"/>
-          <w:insideH w:val="none" w:sz="0" w:space="0" w:color="auto"/>
-          <w:insideV w:val="none" w:sz="0" w:space="0" w:color="auto"/>
+          <w:top w:val="none" w:color="auto" w:sz="0" w:space="0"/>
+          <w:left w:val="none" w:color="auto" w:sz="0" w:space="0"/>
+          <w:bottom w:val="none" w:color="auto" w:sz="0" w:space="0"/>
+          <w:right w:val="none" w:color="auto" w:sz="0" w:space="0"/>
+          <w:insideH w:val="none" w:color="auto" w:sz="0" w:space="0"/>
+          <w:insideV w:val="none" w:color="auto" w:sz="0" w:space="0"/>
         </w:tblBorders>
         <w:tblLook w:val="04A0" w:firstRow="1" w:lastRow="0" w:firstColumn="1" w:lastColumn="0" w:noHBand="0" w:noVBand="1"/>
       </w:tblPr>
@@ -39,6 +39,7 @@
             <w:dataBinding w:prefixMappings="xmlns:ns0='urn:microsoft-dynamics-nav/reports/NPR_CRO_Fiscal_Bill_A4/6014554/' " w:xpath="/ns0:NavWordReportXmlPart[1]/ns0:CROPOSAuditLogAuxInfo[1]/ns0:POSStore[1]/ns0:CRO_POSStore_Name[1]" w:storeItemID="{974C08F4-FF06-4D7D-A995-8F2136C1311A}"/>
             <w:text/>
           </w:sdtPr>
+          <w:sdtEndPr/>
           <w:sdtContent>
             <w:tc>
               <w:tcPr>
@@ -84,6 +85,7 @@
             <w:dataBinding w:prefixMappings="xmlns:ns0='urn:microsoft-dynamics-nav/reports/NPR_CRO_Fiscal_Bill_A4/6014554/' " w:xpath="/ns0:NavWordReportXmlPart[1]/ns0:CROPOSAuditLogAuxInfo[1]/ns0:POSStore[1]/ns0:CRO_POSStore_Address[1]" w:storeItemID="{974C08F4-FF06-4D7D-A995-8F2136C1311A}"/>
             <w:text/>
           </w:sdtPr>
+          <w:sdtEndPr/>
           <w:sdtContent>
             <w:tc>
               <w:tcPr>
@@ -168,6 +170,7 @@
             <w:dataBinding w:prefixMappings="xmlns:ns0='urn:microsoft-dynamics-nav/reports/NPR_CRO_Fiscal_Bill_A4/6014554/' " w:xpath="/ns0:NavWordReportXmlPart[1]/ns0:CROPOSAuditLogAuxInfo[1]/ns0:CRO_BillNo[1]" w:storeItemID="{974C08F4-FF06-4D7D-A995-8F2136C1311A}"/>
             <w:text/>
           </w:sdtPr>
+          <w:sdtEndPr/>
           <w:sdtContent>
             <w:tc>
               <w:tcPr>
@@ -211,6 +214,7 @@
             <w:dataBinding w:prefixMappings="xmlns:ns0='urn:microsoft-dynamics-nav/reports/NPR_CRO_Fiscal_Bill_A4/6014554/' " w:xpath="/ns0:NavWordReportXmlPart[1]/ns0:CROPOSAuditLogAuxInfo[1]/ns0:CRO_Bill_DateTime[1]" w:storeItemID="{974C08F4-FF06-4D7D-A995-8F2136C1311A}"/>
             <w:text/>
           </w:sdtPr>
+          <w:sdtEndPr/>
           <w:sdtContent>
             <w:tc>
               <w:tcPr>
@@ -242,27 +246,28 @@
         <w:trPr>
           <w:trHeight w:val="288"/>
         </w:trPr>
-        <w:sdt>
-          <w:sdtPr>
-            <w:rPr>
-              <w:sz w:val="22"/>
-              <w:szCs w:val="22"/>
-            </w:rPr>
-            <w:alias w:val="#Nav: /CROPOSAuditLogAuxInfo/POSEntrySalesLines/CRO_SalespersonName"/>
-            <w:tag w:val="#Nav: NPR_CRO_Fiscal_Bill_A4/6014554"/>
-            <w:id w:val="265735604"/>
-            <w:placeholder>
-              <w:docPart w:val="4B0C888601D04A73B795656C31CBC59B"/>
-            </w:placeholder>
-            <w:dataBinding w:prefixMappings="xmlns:ns0='urn:microsoft-dynamics-nav/reports/NPR_CRO_Fiscal_Bill_A4/6014554/' " w:xpath="/ns0:NavWordReportXmlPart[1]/ns0:CROPOSAuditLogAuxInfo[1]/ns0:POSEntrySalesLines[1]/ns0:CRO_SalespersonName[1]" w:storeItemID="{974C08F4-FF06-4D7D-A995-8F2136C1311A}"/>
-            <w:text/>
-          </w:sdtPr>
-          <w:sdtContent>
-            <w:tc>
-              <w:tcPr>
-                <w:tcW w:w="10456" w:type="dxa"/>
-                <w:gridSpan w:val="3"/>
-              </w:tcPr>
+        <w:tc>
+          <w:tcPr>
+            <w:tcW w:w="10456" w:type="dxa"/>
+            <w:gridSpan w:val="3"/>
+          </w:tcPr>
+          <w:sdt>
+            <w:sdtPr>
+              <w:rPr>
+                <w:sz w:val="22"/>
+                <w:szCs w:val="22"/>
+              </w:rPr>
+              <w:alias w:val="#Nav: /CROPOSAuditLogAuxInfo/POSEntrySalesLines/CRO_SalespersonName"/>
+              <w:tag w:val="#Nav: NPR_CRO_Fiscal_Bill_A4/6014554"/>
+              <w:id w:val="265735604"/>
+              <w:placeholder>
+                <w:docPart w:val="4B0C888601D04A73B795656C31CBC59B"/>
+              </w:placeholder>
+              <w:dataBinding w:prefixMappings="xmlns:ns0='urn:microsoft-dynamics-nav/reports/NPR_CRO_Fiscal_Bill_A4/6014554/' " w:xpath="/ns0:NavWordReportXmlPart[1]/ns0:CROPOSAuditLogAuxInfo[1]/ns0:POSEntrySalesLines[1]/ns0:CRO_SalespersonName[1]" w:storeItemID="{974C08F4-FF06-4D7D-A995-8F2136C1311A}"/>
+              <w:text/>
+            </w:sdtPr>
+            <w:sdtEndPr/>
+            <w:sdtContent>
               <w:p>
                 <w:pPr>
                   <w:rPr>
@@ -280,9 +285,45 @@
                 </w:r>
                 <w:proofErr w:type="spellEnd"/>
               </w:p>
-            </w:tc>
-          </w:sdtContent>
-        </w:sdt>
+            </w:sdtContent>
+          </w:sdt>
+          <w:sdt>
+            <w:sdtPr>
+              <w:rPr>
+                <w:sz w:val="22"/>
+                <w:szCs w:val="22"/>
+              </w:rPr>
+              <w:alias w:val="#Nav: /CROPOSAuditLogAuxInfo/CRO_SourceDocumentNo"/>
+              <w:tag w:val="#Nav: NPR_CRO_Fiscal_Bill_A4/6014554"/>
+              <w:id w:val="2047868475"/>
+              <w:placeholder>
+                <w:docPart w:val="DefaultPlaceholder_-1854013440"/>
+              </w:placeholder>
+              <w:dataBinding w:prefixMappings="xmlns:ns0='urn:microsoft-dynamics-nav/reports/NPR_CRO_Fiscal_Bill_A4/6014554/' " w:xpath="/ns0:NavWordReportXmlPart[1]/ns0:CROPOSAuditLogAuxInfo[1]/ns0:CRO_SourceDocumentNo[1]" w:storeItemID="{974C08F4-FF06-4D7D-A995-8F2136C1311A}"/>
+              <w:text/>
+            </w:sdtPr>
+            <w:sdtEndPr/>
+            <w:sdtContent>
+              <w:p>
+                <w:pPr>
+                  <w:rPr>
+                    <w:sz w:val="22"/>
+                    <w:szCs w:val="22"/>
+                  </w:rPr>
+                </w:pPr>
+                <w:proofErr w:type="spellStart"/>
+                <w:r>
+                  <w:rPr>
+                    <w:sz w:val="22"/>
+                    <w:szCs w:val="22"/>
+                  </w:rPr>
+                  <w:t>CRO_SourceDocumentNo</w:t>
+                </w:r>
+                <w:proofErr w:type="spellEnd"/>
+              </w:p>
+            </w:sdtContent>
+          </w:sdt>
+        </w:tc>
       </w:tr>
       <w:tr>
         <w:trPr>
@@ -303,6 +344,7 @@
             <w:dataBinding w:prefixMappings="xmlns:ns0='urn:microsoft-dynamics-nav/reports/NPR_CRO_Fiscal_Bill_A4/6014554/' " w:xpath="/ns0:NavWordReportXmlPart[1]/ns0:CROPOSAuditLogAuxInfo[1]/ns0:Customer[1]/ns0:CRO_Customer_InformationBlock[1]" w:storeItemID="{974C08F4-FF06-4D7D-A995-8F2136C1311A}"/>
             <w:text/>
           </w:sdtPr>
+          <w:sdtEndPr/>
           <w:sdtContent>
             <w:tc>
               <w:tcPr>
@@ -346,13 +388,14 @@
             <w:dataBinding w:prefixMappings="xmlns:ns0='urn:microsoft-dynamics-nav/reports/NPR_CRO_Fiscal_Bill_A4/6014554/' " w:xpath="/ns0:NavWordReportXmlPart[1]/ns0:CROPOSAuditLogAuxInfo[1]/ns0:CRO_CopyText[1]" w:storeItemID="{974C08F4-FF06-4D7D-A995-8F2136C1311A}"/>
             <w:text/>
           </w:sdtPr>
+          <w:sdtEndPr/>
           <w:sdtContent>
             <w:tc>
               <w:tcPr>
                 <w:tcW w:w="10456" w:type="dxa"/>
                 <w:gridSpan w:val="3"/>
                 <w:tcBorders>
-                  <w:bottom w:val="single" w:sz="4" w:space="0" w:color="auto"/>
+                  <w:bottom w:val="single" w:color="auto" w:sz="4" w:space="0"/>
                 </w:tcBorders>
               </w:tcPr>
               <w:p>
@@ -389,26 +432,27 @@
     <w:tbl>
       <w:tblPr>
         <w:tblStyle w:val="TableGrid"/>
-        <w:tblW w:w="0" w:type="auto"/>
+        <w:tblW w:w="10440" w:type="dxa"/>
         <w:tblBorders>
-          <w:top w:val="none" w:sz="0" w:space="0" w:color="auto"/>
-          <w:left w:val="none" w:sz="0" w:space="0" w:color="auto"/>
-          <w:bottom w:val="none" w:sz="0" w:space="0" w:color="auto"/>
-          <w:right w:val="none" w:sz="0" w:space="0" w:color="auto"/>
-          <w:insideH w:val="none" w:sz="0" w:space="0" w:color="auto"/>
-          <w:insideV w:val="none" w:sz="0" w:space="0" w:color="auto"/>
+          <w:top w:val="none" w:color="auto" w:sz="0" w:space="0"/>
+          <w:left w:val="none" w:color="auto" w:sz="0" w:space="0"/>
+          <w:bottom w:val="none" w:color="auto" w:sz="0" w:space="0"/>
+          <w:right w:val="none" w:color="auto" w:sz="0" w:space="0"/>
+          <w:insideH w:val="none" w:color="auto" w:sz="0" w:space="0"/>
+          <w:insideV w:val="none" w:color="auto" w:sz="0" w:space="0"/>
         </w:tblBorders>
+        <w:tblLayout w:type="fixed"/>
         <w:tblLook w:val="04A0" w:firstRow="1" w:lastRow="0" w:firstColumn="1" w:lastColumn="0" w:noHBand="0" w:noVBand="1"/>
       </w:tblPr>
       <w:tblGrid>
-        <w:gridCol w:w="1017"/>
-        <w:gridCol w:w="1547"/>
-        <w:gridCol w:w="1087"/>
-        <w:gridCol w:w="875"/>
-        <w:gridCol w:w="1126"/>
-        <w:gridCol w:w="1385"/>
-        <w:gridCol w:w="1599"/>
-        <w:gridCol w:w="1830"/>
+        <w:gridCol w:w="1170"/>
+        <w:gridCol w:w="3420"/>
+        <w:gridCol w:w="916"/>
+        <w:gridCol w:w="869"/>
+        <w:gridCol w:w="973"/>
+        <w:gridCol w:w="662"/>
+        <w:gridCol w:w="1080"/>
+        <w:gridCol w:w="1350"/>
       </w:tblGrid>
       <w:tr>
         <w:sdt>
@@ -428,12 +472,13 @@
             <w:dataBinding w:prefixMappings="xmlns:ns0='urn:microsoft-dynamics-nav/reports/NPR_CRO_Fiscal_Bill_A4/6014554/' " w:xpath="/ns0:NavWordReportXmlPart[1]/ns0:Labels[1]/ns0:ItemNoLbl[1]" w:storeItemID="{974C08F4-FF06-4D7D-A995-8F2136C1311A}"/>
             <w:text/>
           </w:sdtPr>
+          <w:sdtEndPr/>
           <w:sdtContent>
             <w:tc>
               <w:tcPr>
-                <w:tcW w:w="1082" w:type="dxa"/>
+                <w:tcW w:w="1170" w:type="dxa"/>
                 <w:tcBorders>
-                  <w:bottom w:val="single" w:sz="4" w:space="0" w:color="auto"/>
+                  <w:bottom w:val="single" w:color="auto" w:sz="4" w:space="0"/>
                 </w:tcBorders>
               </w:tcPr>
               <w:p>
@@ -477,12 +522,13 @@
             <w:dataBinding w:prefixMappings="xmlns:ns0='urn:microsoft-dynamics-nav/reports/NPR_CRO_Fiscal_Bill_A4/6014554/' " w:xpath="/ns0:NavWordReportXmlPart[1]/ns0:Labels[1]/ns0:ItemNameLbl[1]" w:storeItemID="{974C08F4-FF06-4D7D-A995-8F2136C1311A}"/>
             <w:text/>
           </w:sdtPr>
+          <w:sdtEndPr/>
           <w:sdtContent>
             <w:tc>
               <w:tcPr>
-                <w:tcW w:w="1655" w:type="dxa"/>
+                <w:tcW w:w="3420" w:type="dxa"/>
                 <w:tcBorders>
-                  <w:bottom w:val="single" w:sz="4" w:space="0" w:color="auto"/>
+                  <w:bottom w:val="single" w:color="auto" w:sz="4" w:space="0"/>
                 </w:tcBorders>
               </w:tcPr>
               <w:p>
@@ -526,12 +572,13 @@
             <w:dataBinding w:prefixMappings="xmlns:ns0='urn:microsoft-dynamics-nav/reports/NPR_CRO_Fiscal_Bill_A4/6014554/' " w:xpath="/ns0:NavWordReportXmlPart[1]/ns0:Labels[1]/ns0:QtyLbl[1]" w:storeItemID="{974C08F4-FF06-4D7D-A995-8F2136C1311A}"/>
             <w:text/>
           </w:sdtPr>
+          <w:sdtEndPr/>
           <w:sdtContent>
             <w:tc>
               <w:tcPr>
-                <w:tcW w:w="1158" w:type="dxa"/>
+                <w:tcW w:w="916" w:type="dxa"/>
                 <w:tcBorders>
-                  <w:bottom w:val="single" w:sz="4" w:space="0" w:color="auto"/>
+                  <w:bottom w:val="single" w:color="auto" w:sz="4" w:space="0"/>
                 </w:tcBorders>
               </w:tcPr>
               <w:p>
@@ -576,12 +623,13 @@
             <w:dataBinding w:prefixMappings="xmlns:ns0='urn:microsoft-dynamics-nav/reports/NPR_CRO_Fiscal_Bill_A4/6014554/' " w:xpath="/ns0:NavWordReportXmlPart[1]/ns0:Labels[1]/ns0:UoMLbl[1]" w:storeItemID="{974C08F4-FF06-4D7D-A995-8F2136C1311A}"/>
             <w:text/>
           </w:sdtPr>
+          <w:sdtEndPr/>
           <w:sdtContent>
             <w:tc>
               <w:tcPr>
-                <w:tcW w:w="220" w:type="dxa"/>
+                <w:tcW w:w="869" w:type="dxa"/>
                 <w:tcBorders>
-                  <w:bottom w:val="single" w:sz="4" w:space="0" w:color="auto"/>
+                  <w:bottom w:val="single" w:color="auto" w:sz="4" w:space="0"/>
                 </w:tcBorders>
               </w:tcPr>
               <w:p>
@@ -625,12 +673,13 @@
             <w:dataBinding w:prefixMappings="xmlns:ns0='urn:microsoft-dynamics-nav/reports/NPR_CRO_Fiscal_Bill_A4/6014554/' " w:xpath="/ns0:NavWordReportXmlPart[1]/ns0:Labels[1]/ns0:PriceLbl[1]" w:storeItemID="{974C08F4-FF06-4D7D-A995-8F2136C1311A}"/>
             <w:text/>
           </w:sdtPr>
+          <w:sdtEndPr/>
           <w:sdtContent>
             <w:tc>
               <w:tcPr>
-                <w:tcW w:w="1200" w:type="dxa"/>
+                <w:tcW w:w="973" w:type="dxa"/>
                 <w:tcBorders>
-                  <w:bottom w:val="single" w:sz="4" w:space="0" w:color="auto"/>
+                  <w:bottom w:val="single" w:color="auto" w:sz="4" w:space="0"/>
                 </w:tcBorders>
               </w:tcPr>
               <w:p>
@@ -675,12 +724,13 @@
             <w:dataBinding w:prefixMappings="xmlns:ns0='urn:microsoft-dynamics-nav/reports/NPR_CRO_Fiscal_Bill_A4/6014554/' " w:xpath="/ns0:NavWordReportXmlPart[1]/ns0:Labels[1]/ns0:PercLbl[1]" w:storeItemID="{974C08F4-FF06-4D7D-A995-8F2136C1311A}"/>
             <w:text/>
           </w:sdtPr>
+          <w:sdtEndPr/>
           <w:sdtContent>
             <w:tc>
               <w:tcPr>
-                <w:tcW w:w="1480" w:type="dxa"/>
+                <w:tcW w:w="662" w:type="dxa"/>
                 <w:tcBorders>
-                  <w:bottom w:val="single" w:sz="4" w:space="0" w:color="auto"/>
+                  <w:bottom w:val="single" w:color="auto" w:sz="4" w:space="0"/>
                 </w:tcBorders>
               </w:tcPr>
               <w:p>
@@ -725,12 +775,13 @@
             <w:dataBinding w:prefixMappings="xmlns:ns0='urn:microsoft-dynamics-nav/reports/NPR_CRO_Fiscal_Bill_A4/6014554/' " w:xpath="/ns0:NavWordReportXmlPart[1]/ns0:Labels[1]/ns0:DiscountLbl[1]" w:storeItemID="{974C08F4-FF06-4D7D-A995-8F2136C1311A}"/>
             <w:text/>
           </w:sdtPr>
+          <w:sdtEndPr/>
           <w:sdtContent>
             <w:tc>
               <w:tcPr>
-                <w:tcW w:w="1711" w:type="dxa"/>
+                <w:tcW w:w="1080" w:type="dxa"/>
                 <w:tcBorders>
-                  <w:bottom w:val="single" w:sz="4" w:space="0" w:color="auto"/>
+                  <w:bottom w:val="single" w:color="auto" w:sz="4" w:space="0"/>
                 </w:tcBorders>
               </w:tcPr>
               <w:p>
@@ -775,12 +826,13 @@
             <w:dataBinding w:prefixMappings="xmlns:ns0='urn:microsoft-dynamics-nav/reports/NPR_CRO_Fiscal_Bill_A4/6014554/' " w:xpath="/ns0:NavWordReportXmlPart[1]/ns0:Labels[1]/ns0:TotalLbl[1]" w:storeItemID="{974C08F4-FF06-4D7D-A995-8F2136C1311A}"/>
             <w:text/>
           </w:sdtPr>
+          <w:sdtEndPr/>
           <w:sdtContent>
             <w:tc>
               <w:tcPr>
-                <w:tcW w:w="1960" w:type="dxa"/>
+                <w:tcW w:w="1350" w:type="dxa"/>
                 <w:tcBorders>
-                  <w:bottom w:val="single" w:sz="4" w:space="0" w:color="auto"/>
+                  <w:bottom w:val="single" w:color="auto" w:sz="4" w:space="0"/>
                 </w:tcBorders>
               </w:tcPr>
               <w:p>
@@ -812,9 +864,9 @@
       <w:tr>
         <w:tc>
           <w:tcPr>
-            <w:tcW w:w="1082" w:type="dxa"/>
+            <w:tcW w:w="1170" w:type="dxa"/>
             <w:tcBorders>
-              <w:top w:val="single" w:sz="4" w:space="0" w:color="auto"/>
+              <w:top w:val="single" w:color="auto" w:sz="4" w:space="0"/>
             </w:tcBorders>
           </w:tcPr>
           <w:p>
@@ -828,9 +880,9 @@
         </w:tc>
         <w:tc>
           <w:tcPr>
-            <w:tcW w:w="1655" w:type="dxa"/>
+            <w:tcW w:w="3420" w:type="dxa"/>
             <w:tcBorders>
-              <w:top w:val="single" w:sz="4" w:space="0" w:color="auto"/>
+              <w:top w:val="single" w:color="auto" w:sz="4" w:space="0"/>
             </w:tcBorders>
           </w:tcPr>
           <w:p>
@@ -844,9 +896,9 @@
         </w:tc>
         <w:tc>
           <w:tcPr>
-            <w:tcW w:w="1158" w:type="dxa"/>
+            <w:tcW w:w="916" w:type="dxa"/>
             <w:tcBorders>
-              <w:top w:val="single" w:sz="4" w:space="0" w:color="auto"/>
+              <w:top w:val="single" w:color="auto" w:sz="4" w:space="0"/>
             </w:tcBorders>
           </w:tcPr>
           <w:p>
@@ -861,9 +913,9 @@
         </w:tc>
         <w:tc>
           <w:tcPr>
-            <w:tcW w:w="220" w:type="dxa"/>
+            <w:tcW w:w="869" w:type="dxa"/>
             <w:tcBorders>
-              <w:top w:val="single" w:sz="4" w:space="0" w:color="auto"/>
+              <w:top w:val="single" w:color="auto" w:sz="4" w:space="0"/>
             </w:tcBorders>
           </w:tcPr>
           <w:p>
@@ -877,9 +929,9 @@
         </w:tc>
         <w:tc>
           <w:tcPr>
-            <w:tcW w:w="1200" w:type="dxa"/>
+            <w:tcW w:w="973" w:type="dxa"/>
             <w:tcBorders>
-              <w:top w:val="single" w:sz="4" w:space="0" w:color="auto"/>
+              <w:top w:val="single" w:color="auto" w:sz="4" w:space="0"/>
             </w:tcBorders>
           </w:tcPr>
           <w:p>
@@ -894,9 +946,9 @@
         </w:tc>
         <w:tc>
           <w:tcPr>
-            <w:tcW w:w="1480" w:type="dxa"/>
+            <w:tcW w:w="662" w:type="dxa"/>
             <w:tcBorders>
-              <w:top w:val="single" w:sz="4" w:space="0" w:color="auto"/>
+              <w:top w:val="single" w:color="auto" w:sz="4" w:space="0"/>
             </w:tcBorders>
           </w:tcPr>
           <w:p>
@@ -911,9 +963,9 @@
         </w:tc>
         <w:tc>
           <w:tcPr>
-            <w:tcW w:w="1711" w:type="dxa"/>
+            <w:tcW w:w="1080" w:type="dxa"/>
             <w:tcBorders>
-              <w:top w:val="single" w:sz="4" w:space="0" w:color="auto"/>
+              <w:top w:val="single" w:color="auto" w:sz="4" w:space="0"/>
             </w:tcBorders>
           </w:tcPr>
           <w:p>
@@ -928,9 +980,9 @@
         </w:tc>
         <w:tc>
           <w:tcPr>
-            <w:tcW w:w="1960" w:type="dxa"/>
+            <w:tcW w:w="1350" w:type="dxa"/>
             <w:tcBorders>
-              <w:top w:val="single" w:sz="4" w:space="0" w:color="auto"/>
+              <w:top w:val="single" w:color="auto" w:sz="4" w:space="0"/>
             </w:tcBorders>
           </w:tcPr>
           <w:p>
@@ -956,6 +1008,7 @@
           <w15:dataBinding w:prefixMappings="xmlns:ns0='urn:microsoft-dynamics-nav/reports/NPR_CRO_Fiscal_Bill_A4/6014554/' " w:xpath="/ns0:NavWordReportXmlPart[1]/ns0:CROPOSAuditLogAuxInfo[1]/ns0:POSEntrySalesLines" w:storeItemID="{974C08F4-FF06-4D7D-A995-8F2136C1311A}"/>
           <w15:repeatingSection/>
         </w:sdtPr>
+        <w:sdtEndPr/>
         <w:sdtContent>
           <w:sdt>
             <w:sdtPr>
@@ -969,6 +1022,7 @@
               </w:placeholder>
               <w15:repeatingSectionItem/>
             </w:sdtPr>
+            <w:sdtEndPr/>
             <w:sdtContent>
               <w:tr>
                 <w:sdt>
@@ -986,10 +1040,11 @@
                     <w:dataBinding w:prefixMappings="xmlns:ns0='urn:microsoft-dynamics-nav/reports/NPR_CRO_Fiscal_Bill_A4/6014554/' " w:xpath="/ns0:NavWordReportXmlPart[1]/ns0:CROPOSAuditLogAuxInfo[1]/ns0:POSEntrySalesLines[1]/ns0:CRO_ItemNo[1]" w:storeItemID="{974C08F4-FF06-4D7D-A995-8F2136C1311A}"/>
                     <w:text/>
                   </w:sdtPr>
+                  <w:sdtEndPr/>
                   <w:sdtContent>
                     <w:tc>
                       <w:tcPr>
-                        <w:tcW w:w="1082" w:type="dxa"/>
+                        <w:tcW w:w="1170" w:type="dxa"/>
                       </w:tcPr>
                       <w:p>
                         <w:pPr>
@@ -1026,10 +1081,11 @@
                     <w:dataBinding w:prefixMappings="xmlns:ns0='urn:microsoft-dynamics-nav/reports/NPR_CRO_Fiscal_Bill_A4/6014554/' " w:xpath="/ns0:NavWordReportXmlPart[1]/ns0:CROPOSAuditLogAuxInfo[1]/ns0:POSEntrySalesLines[1]/ns0:CRO_ItemDescription[1]" w:storeItemID="{974C08F4-FF06-4D7D-A995-8F2136C1311A}"/>
                     <w:text/>
                   </w:sdtPr>
+                  <w:sdtEndPr/>
                   <w:sdtContent>
                     <w:tc>
                       <w:tcPr>
-                        <w:tcW w:w="1655" w:type="dxa"/>
+                        <w:tcW w:w="3420" w:type="dxa"/>
                       </w:tcPr>
                       <w:p>
                         <w:pPr>
@@ -1066,10 +1122,11 @@
                     <w:dataBinding w:prefixMappings="xmlns:ns0='urn:microsoft-dynamics-nav/reports/NPR_CRO_Fiscal_Bill_A4/6014554/' " w:xpath="/ns0:NavWordReportXmlPart[1]/ns0:CROPOSAuditLogAuxInfo[1]/ns0:POSEntrySalesLines[1]/ns0:CRO_Quantity[1]" w:storeItemID="{974C08F4-FF06-4D7D-A995-8F2136C1311A}"/>
                     <w:text/>
                   </w:sdtPr>
+                  <w:sdtEndPr/>
                   <w:sdtContent>
                     <w:tc>
                       <w:tcPr>
-                        <w:tcW w:w="1158" w:type="dxa"/>
+                        <w:tcW w:w="916" w:type="dxa"/>
                       </w:tcPr>
                       <w:p>
                         <w:pPr>
@@ -1107,10 +1164,11 @@
                     <w:dataBinding w:prefixMappings="xmlns:ns0='urn:microsoft-dynamics-nav/reports/NPR_CRO_Fiscal_Bill_A4/6014554/' " w:xpath="/ns0:NavWordReportXmlPart[1]/ns0:CROPOSAuditLogAuxInfo[1]/ns0:POSEntrySalesLines[1]/ns0:CRO_UOM[1]" w:storeItemID="{974C08F4-FF06-4D7D-A995-8F2136C1311A}"/>
                     <w:text/>
                   </w:sdtPr>
+                  <w:sdtEndPr/>
                   <w:sdtContent>
                     <w:tc>
                       <w:tcPr>
-                        <w:tcW w:w="220" w:type="dxa"/>
+                        <w:tcW w:w="869" w:type="dxa"/>
                       </w:tcPr>
                       <w:p>
                         <w:pPr>
@@ -1145,10 +1203,11 @@
                     <w:dataBinding w:prefixMappings="xmlns:ns0='urn:microsoft-dynamics-nav/reports/NPR_CRO_Fiscal_Bill_A4/6014554/' " w:xpath="/ns0:NavWordReportXmlPart[1]/ns0:CROPOSAuditLogAuxInfo[1]/ns0:POSEntrySalesLines[1]/ns0:CRO_UnitPrice[1]" w:storeItemID="{974C08F4-FF06-4D7D-A995-8F2136C1311A}"/>
                     <w:text/>
                   </w:sdtPr>
+                  <w:sdtEndPr/>
                   <w:sdtContent>
                     <w:tc>
                       <w:tcPr>
-                        <w:tcW w:w="1200" w:type="dxa"/>
+                        <w:tcW w:w="973" w:type="dxa"/>
                       </w:tcPr>
                       <w:p>
                         <w:pPr>
@@ -1186,10 +1245,11 @@
                     <w:dataBinding w:prefixMappings="xmlns:ns0='urn:microsoft-dynamics-nav/reports/NPR_CRO_Fiscal_Bill_A4/6014554/' " w:xpath="/ns0:NavWordReportXmlPart[1]/ns0:CROPOSAuditLogAuxInfo[1]/ns0:POSEntrySalesLines[1]/ns0:CRO_DiscountPerc[1]" w:storeItemID="{974C08F4-FF06-4D7D-A995-8F2136C1311A}"/>
                     <w:text/>
                   </w:sdtPr>
+                  <w:sdtEndPr/>
                   <w:sdtContent>
                     <w:tc>
                       <w:tcPr>
-                        <w:tcW w:w="1480" w:type="dxa"/>
+                        <w:tcW w:w="662" w:type="dxa"/>
                       </w:tcPr>
                       <w:p>
                         <w:pPr>
@@ -1227,10 +1287,11 @@
                     <w:dataBinding w:prefixMappings="xmlns:ns0='urn:microsoft-dynamics-nav/reports/NPR_CRO_Fiscal_Bill_A4/6014554/' " w:xpath="/ns0:NavWordReportXmlPart[1]/ns0:CROPOSAuditLogAuxInfo[1]/ns0:POSEntrySalesLines[1]/ns0:CRO_DiscountAmount[1]" w:storeItemID="{974C08F4-FF06-4D7D-A995-8F2136C1311A}"/>
                     <w:text/>
                   </w:sdtPr>
+                  <w:sdtEndPr/>
                   <w:sdtContent>
                     <w:tc>
                       <w:tcPr>
-                        <w:tcW w:w="1711" w:type="dxa"/>
+                        <w:tcW w:w="1080" w:type="dxa"/>
                       </w:tcPr>
                       <w:p>
                         <w:pPr>
@@ -1268,10 +1329,11 @@
                     <w:dataBinding w:prefixMappings="xmlns:ns0='urn:microsoft-dynamics-nav/reports/NPR_CRO_Fiscal_Bill_A4/6014554/' " w:xpath="/ns0:NavWordReportXmlPart[1]/ns0:CROPOSAuditLogAuxInfo[1]/ns0:POSEntrySalesLines[1]/ns0:CRO_AmountIncludingVAT[1]" w:storeItemID="{974C08F4-FF06-4D7D-A995-8F2136C1311A}"/>
                     <w:text/>
                   </w:sdtPr>
+                  <w:sdtEndPr/>
                   <w:sdtContent>
                     <w:tc>
                       <w:tcPr>
-                        <w:tcW w:w="1960" w:type="dxa"/>
+                        <w:tcW w:w="1350" w:type="dxa"/>
                       </w:tcPr>
                       <w:p>
                         <w:pPr>
@@ -1313,12 +1375,12 @@
         <w:tblStyle w:val="TableGrid"/>
         <w:tblW w:w="0" w:type="auto"/>
         <w:tblBorders>
-          <w:top w:val="none" w:sz="0" w:space="0" w:color="auto"/>
-          <w:left w:val="none" w:sz="0" w:space="0" w:color="auto"/>
-          <w:bottom w:val="none" w:sz="0" w:space="0" w:color="auto"/>
-          <w:right w:val="none" w:sz="0" w:space="0" w:color="auto"/>
-          <w:insideH w:val="none" w:sz="0" w:space="0" w:color="auto"/>
-          <w:insideV w:val="none" w:sz="0" w:space="0" w:color="auto"/>
+          <w:top w:val="none" w:color="auto" w:sz="0" w:space="0"/>
+          <w:left w:val="none" w:color="auto" w:sz="0" w:space="0"/>
+          <w:bottom w:val="none" w:color="auto" w:sz="0" w:space="0"/>
+          <w:right w:val="none" w:color="auto" w:sz="0" w:space="0"/>
+          <w:insideH w:val="none" w:color="auto" w:sz="0" w:space="0"/>
+          <w:insideV w:val="none" w:color="auto" w:sz="0" w:space="0"/>
         </w:tblBorders>
         <w:tblLook w:val="04A0" w:firstRow="1" w:lastRow="0" w:firstColumn="1" w:lastColumn="0" w:noHBand="0" w:noVBand="1"/>
       </w:tblPr>
@@ -1347,13 +1409,14 @@
             <w:dataBinding w:prefixMappings="xmlns:ns0='urn:microsoft-dynamics-nav/reports/NPR_CRO_Fiscal_Bill_A4/6014554/' " w:xpath="/ns0:NavWordReportXmlPart[1]/ns0:Labels[1]/ns0:ToPayLbl[1]" w:storeItemID="{974C08F4-FF06-4D7D-A995-8F2136C1311A}"/>
             <w:text/>
           </w:sdtPr>
+          <w:sdtEndPr/>
           <w:sdtContent>
             <w:tc>
               <w:tcPr>
                 <w:tcW w:w="5228" w:type="dxa"/>
                 <w:tcBorders>
-                  <w:top w:val="single" w:sz="4" w:space="0" w:color="auto"/>
-                  <w:bottom w:val="single" w:sz="4" w:space="0" w:color="auto"/>
+                  <w:top w:val="single" w:color="auto" w:sz="4" w:space="0"/>
+                  <w:bottom w:val="single" w:color="auto" w:sz="4" w:space="0"/>
                 </w:tcBorders>
               </w:tcPr>
               <w:p>
@@ -1395,13 +1458,14 @@
             <w:dataBinding w:prefixMappings="xmlns:ns0='urn:microsoft-dynamics-nav/reports/NPR_CRO_Fiscal_Bill_A4/6014554/' " w:xpath="/ns0:NavWordReportXmlPart[1]/ns0:CROPOSAuditLogAuxInfo[1]/ns0:CRO_TotalAmount[1]" w:storeItemID="{974C08F4-FF06-4D7D-A995-8F2136C1311A}"/>
             <w:text/>
           </w:sdtPr>
+          <w:sdtEndPr/>
           <w:sdtContent>
             <w:tc>
               <w:tcPr>
                 <w:tcW w:w="5228" w:type="dxa"/>
                 <w:tcBorders>
-                  <w:top w:val="single" w:sz="4" w:space="0" w:color="auto"/>
-                  <w:bottom w:val="single" w:sz="4" w:space="0" w:color="auto"/>
+                  <w:top w:val="single" w:color="auto" w:sz="4" w:space="0"/>
+                  <w:bottom w:val="single" w:color="auto" w:sz="4" w:space="0"/>
                 </w:tcBorders>
               </w:tcPr>
               <w:p>
@@ -1433,7 +1497,7 @@
           <w:tcPr>
             <w:tcW w:w="5228" w:type="dxa"/>
             <w:tcBorders>
-              <w:top w:val="single" w:sz="4" w:space="0" w:color="auto"/>
+              <w:top w:val="single" w:color="auto" w:sz="4" w:space="0"/>
             </w:tcBorders>
           </w:tcPr>
           <w:p>
@@ -1451,7 +1515,7 @@
           <w:tcPr>
             <w:tcW w:w="5228" w:type="dxa"/>
             <w:tcBorders>
-              <w:top w:val="single" w:sz="4" w:space="0" w:color="auto"/>
+              <w:top w:val="single" w:color="auto" w:sz="4" w:space="0"/>
             </w:tcBorders>
           </w:tcPr>
           <w:p>
@@ -1485,12 +1549,13 @@
             <w:dataBinding w:prefixMappings="xmlns:ns0='urn:microsoft-dynamics-nav/reports/NPR_CRO_Fiscal_Bill_A4/6014554/' " w:xpath="/ns0:NavWordReportXmlPart[1]/ns0:Labels[1]/ns0:PaymentMethodLbl[1]" w:storeItemID="{974C08F4-FF06-4D7D-A995-8F2136C1311A}"/>
             <w:text/>
           </w:sdtPr>
+          <w:sdtEndPr/>
           <w:sdtContent>
             <w:tc>
               <w:tcPr>
                 <w:tcW w:w="5228" w:type="dxa"/>
                 <w:tcBorders>
-                  <w:bottom w:val="single" w:sz="4" w:space="0" w:color="auto"/>
+                  <w:bottom w:val="single" w:color="auto" w:sz="4" w:space="0"/>
                 </w:tcBorders>
               </w:tcPr>
               <w:p>
@@ -1534,12 +1599,13 @@
             <w:dataBinding w:prefixMappings="xmlns:ns0='urn:microsoft-dynamics-nav/reports/NPR_CRO_Fiscal_Bill_A4/6014554/' " w:xpath="/ns0:NavWordReportXmlPart[1]/ns0:Labels[1]/ns0:TaxAmountLbl[1]" w:storeItemID="{974C08F4-FF06-4D7D-A995-8F2136C1311A}"/>
             <w:text/>
           </w:sdtPr>
+          <w:sdtEndPr/>
           <w:sdtContent>
             <w:tc>
               <w:tcPr>
                 <w:tcW w:w="5228" w:type="dxa"/>
                 <w:tcBorders>
-                  <w:bottom w:val="single" w:sz="4" w:space="0" w:color="auto"/>
+                  <w:bottom w:val="single" w:color="auto" w:sz="4" w:space="0"/>
                 </w:tcBorders>
               </w:tcPr>
               <w:p>
@@ -1571,7 +1637,7 @@
           <w:tcPr>
             <w:tcW w:w="5228" w:type="dxa"/>
             <w:tcBorders>
-              <w:top w:val="single" w:sz="4" w:space="0" w:color="auto"/>
+              <w:top w:val="single" w:color="auto" w:sz="4" w:space="0"/>
             </w:tcBorders>
           </w:tcPr>
           <w:p>
@@ -1589,7 +1655,7 @@
           <w:tcPr>
             <w:tcW w:w="5228" w:type="dxa"/>
             <w:tcBorders>
-              <w:top w:val="single" w:sz="4" w:space="0" w:color="auto"/>
+              <w:top w:val="single" w:color="auto" w:sz="4" w:space="0"/>
             </w:tcBorders>
           </w:tcPr>
           <w:p>
@@ -1713,6 +1779,7 @@
                     <w:dataBinding w:prefixMappings="xmlns:ns0='urn:microsoft-dynamics-nav/reports/NPR_CRO_Fiscal_Bill_A4/6014554/' " w:xpath="/ns0:NavWordReportXmlPart[1]/ns0:CROPOSAuditLogAuxInfo[1]/ns0:POSEntryPaymentLines[1]/ns0:CRO_Amount[1]" w:storeItemID="{974C08F4-FF06-4D7D-A995-8F2136C1311A}"/>
                     <w:text/>
                   </w:sdtPr>
+                  <w:sdtEndPr/>
                   <w:sdtContent>
                     <w:tc>
                       <w:tcPr>
@@ -1758,12 +1825,12 @@
         <w:tblStyle w:val="TableGrid"/>
         <w:tblW w:w="0" w:type="auto"/>
         <w:tblBorders>
-          <w:top w:val="none" w:sz="0" w:space="0" w:color="auto"/>
-          <w:left w:val="none" w:sz="0" w:space="0" w:color="auto"/>
-          <w:bottom w:val="none" w:sz="0" w:space="0" w:color="auto"/>
-          <w:right w:val="none" w:sz="0" w:space="0" w:color="auto"/>
-          <w:insideH w:val="none" w:sz="0" w:space="0" w:color="auto"/>
-          <w:insideV w:val="none" w:sz="0" w:space="0" w:color="auto"/>
+          <w:top w:val="none" w:color="auto" w:sz="0" w:space="0"/>
+          <w:left w:val="none" w:color="auto" w:sz="0" w:space="0"/>
+          <w:bottom w:val="none" w:color="auto" w:sz="0" w:space="0"/>
+          <w:right w:val="none" w:color="auto" w:sz="0" w:space="0"/>
+          <w:insideH w:val="none" w:color="auto" w:sz="0" w:space="0"/>
+          <w:insideV w:val="none" w:color="auto" w:sz="0" w:space="0"/>
         </w:tblBorders>
         <w:tblLook w:val="04A0" w:firstRow="1" w:lastRow="0" w:firstColumn="1" w:lastColumn="0" w:noHBand="0" w:noVBand="1"/>
       </w:tblPr>
@@ -1794,12 +1861,13 @@
             <w:dataBinding w:prefixMappings="xmlns:ns0='urn:microsoft-dynamics-nav/reports/NPR_CRO_Fiscal_Bill_A4/6014554/' " w:xpath="/ns0:NavWordReportXmlPart[1]/ns0:Labels[1]/ns0:TaxLbl[1]" w:storeItemID="{974C08F4-FF06-4D7D-A995-8F2136C1311A}"/>
             <w:text/>
           </w:sdtPr>
+          <w:sdtEndPr/>
           <w:sdtContent>
             <w:tc>
               <w:tcPr>
                 <w:tcW w:w="2614" w:type="dxa"/>
                 <w:tcBorders>
-                  <w:bottom w:val="single" w:sz="4" w:space="0" w:color="auto"/>
+                  <w:bottom w:val="single" w:color="auto" w:sz="4" w:space="0"/>
                 </w:tcBorders>
               </w:tcPr>
               <w:p>
@@ -1843,12 +1911,13 @@
             <w:dataBinding w:prefixMappings="xmlns:ns0='urn:microsoft-dynamics-nav/reports/NPR_CRO_Fiscal_Bill_A4/6014554/' " w:xpath="/ns0:NavWordReportXmlPart[1]/ns0:Labels[1]/ns0:TaxRateLbl[1]" w:storeItemID="{974C08F4-FF06-4D7D-A995-8F2136C1311A}"/>
             <w:text/>
           </w:sdtPr>
+          <w:sdtEndPr/>
           <w:sdtContent>
             <w:tc>
               <w:tcPr>
                 <w:tcW w:w="2614" w:type="dxa"/>
                 <w:tcBorders>
-                  <w:bottom w:val="single" w:sz="4" w:space="0" w:color="auto"/>
+                  <w:bottom w:val="single" w:color="auto" w:sz="4" w:space="0"/>
                 </w:tcBorders>
               </w:tcPr>
               <w:p>
@@ -1893,12 +1962,13 @@
             <w:dataBinding w:prefixMappings="xmlns:ns0='urn:microsoft-dynamics-nav/reports/NPR_CRO_Fiscal_Bill_A4/6014554/' " w:xpath="/ns0:NavWordReportXmlPart[1]/ns0:Labels[1]/ns0:TaxBaseLbl[1]" w:storeItemID="{974C08F4-FF06-4D7D-A995-8F2136C1311A}"/>
             <w:text/>
           </w:sdtPr>
+          <w:sdtEndPr/>
           <w:sdtContent>
             <w:tc>
               <w:tcPr>
                 <w:tcW w:w="2614" w:type="dxa"/>
                 <w:tcBorders>
-                  <w:bottom w:val="single" w:sz="4" w:space="0" w:color="auto"/>
+                  <w:bottom w:val="single" w:color="auto" w:sz="4" w:space="0"/>
                 </w:tcBorders>
               </w:tcPr>
               <w:p>
@@ -1943,12 +2013,13 @@
             <w:dataBinding w:prefixMappings="xmlns:ns0='urn:microsoft-dynamics-nav/reports/NPR_CRO_Fiscal_Bill_A4/6014554/' " w:xpath="/ns0:NavWordReportXmlPart[1]/ns0:Labels[1]/ns0:TaxAmountLbl[1]" w:storeItemID="{974C08F4-FF06-4D7D-A995-8F2136C1311A}"/>
             <w:text/>
           </w:sdtPr>
+          <w:sdtEndPr/>
           <w:sdtContent>
             <w:tc>
               <w:tcPr>
                 <w:tcW w:w="2614" w:type="dxa"/>
                 <w:tcBorders>
-                  <w:bottom w:val="single" w:sz="4" w:space="0" w:color="auto"/>
+                  <w:bottom w:val="single" w:color="auto" w:sz="4" w:space="0"/>
                 </w:tcBorders>
               </w:tcPr>
               <w:p>
@@ -1985,7 +2056,7 @@
           <w:tcPr>
             <w:tcW w:w="2614" w:type="dxa"/>
             <w:tcBorders>
-              <w:top w:val="single" w:sz="4" w:space="0" w:color="auto"/>
+              <w:top w:val="single" w:color="auto" w:sz="4" w:space="0"/>
             </w:tcBorders>
           </w:tcPr>
           <w:p>
@@ -2003,7 +2074,7 @@
           <w:tcPr>
             <w:tcW w:w="2614" w:type="dxa"/>
             <w:tcBorders>
-              <w:top w:val="single" w:sz="4" w:space="0" w:color="auto"/>
+              <w:top w:val="single" w:color="auto" w:sz="4" w:space="0"/>
             </w:tcBorders>
           </w:tcPr>
           <w:p>
@@ -2021,7 +2092,7 @@
           <w:tcPr>
             <w:tcW w:w="2614" w:type="dxa"/>
             <w:tcBorders>
-              <w:top w:val="single" w:sz="4" w:space="0" w:color="auto"/>
+              <w:top w:val="single" w:color="auto" w:sz="4" w:space="0"/>
             </w:tcBorders>
           </w:tcPr>
           <w:p>
@@ -2039,7 +2110,7 @@
           <w:tcPr>
             <w:tcW w:w="2614" w:type="dxa"/>
             <w:tcBorders>
-              <w:top w:val="single" w:sz="4" w:space="0" w:color="auto"/>
+              <w:top w:val="single" w:color="auto" w:sz="4" w:space="0"/>
             </w:tcBorders>
           </w:tcPr>
           <w:p>
@@ -2067,6 +2138,7 @@
           <w15:dataBinding w:prefixMappings="xmlns:ns0='urn:microsoft-dynamics-nav/reports/NPR_CRO_Fiscal_Bill_A4/6014554/' " w:xpath="/ns0:NavWordReportXmlPart[1]/ns0:CROPOSAuditLogAuxInfo[1]/ns0:POSEntryTaxLines" w:storeItemID="{974C08F4-FF06-4D7D-A995-8F2136C1311A}"/>
           <w15:repeatingSection/>
         </w:sdtPr>
+        <w:sdtEndPr/>
         <w:sdtContent>
           <w:sdt>
             <w:sdtPr>
@@ -2080,6 +2152,7 @@
               </w:placeholder>
               <w15:repeatingSectionItem/>
             </w:sdtPr>
+            <w:sdtEndPr/>
             <w:sdtContent>
               <w:tr>
                 <w:trPr>
@@ -2100,6 +2173,7 @@
                     <w:dataBinding w:prefixMappings="xmlns:ns0='urn:microsoft-dynamics-nav/reports/NPR_CRO_Fiscal_Bill_A4/6014554/' " w:xpath="/ns0:NavWordReportXmlPart[1]/ns0:Labels[1]/ns0:VATLbl[1]" w:storeItemID="{974C08F4-FF06-4D7D-A995-8F2136C1311A}"/>
                     <w:text/>
                   </w:sdtPr>
+                  <w:sdtEndPr/>
                   <w:sdtContent>
                     <w:tc>
                       <w:tcPr>
@@ -2140,6 +2214,7 @@
                     <w:dataBinding w:prefixMappings="xmlns:ns0='urn:microsoft-dynamics-nav/reports/NPR_CRO_Fiscal_Bill_A4/6014554/' " w:xpath="/ns0:NavWordReportXmlPart[1]/ns0:CROPOSAuditLogAuxInfo[1]/ns0:POSEntryTaxLines[1]/ns0:CRO_VATPerc[1]" w:storeItemID="{974C08F4-FF06-4D7D-A995-8F2136C1311A}"/>
                     <w:text/>
                   </w:sdtPr>
+                  <w:sdtEndPr/>
                   <w:sdtContent>
                     <w:tc>
                       <w:tcPr>
@@ -2181,6 +2256,7 @@
                     <w:dataBinding w:prefixMappings="xmlns:ns0='urn:microsoft-dynamics-nav/reports/NPR_CRO_Fiscal_Bill_A4/6014554/' " w:xpath="/ns0:NavWordReportXmlPart[1]/ns0:CROPOSAuditLogAuxInfo[1]/ns0:POSEntryTaxLines[1]/ns0:CRO_VATBaseAmount[1]" w:storeItemID="{974C08F4-FF06-4D7D-A995-8F2136C1311A}"/>
                     <w:text/>
                   </w:sdtPr>
+                  <w:sdtEndPr/>
                   <w:sdtContent>
                     <w:tc>
                       <w:tcPr>
@@ -2222,6 +2298,7 @@
                     <w:dataBinding w:prefixMappings="xmlns:ns0='urn:microsoft-dynamics-nav/reports/NPR_CRO_Fiscal_Bill_A4/6014554/' " w:xpath="/ns0:NavWordReportXmlPart[1]/ns0:CROPOSAuditLogAuxInfo[1]/ns0:POSEntryTaxLines[1]/ns0:CRO_VATAmount[1]" w:storeItemID="{974C08F4-FF06-4D7D-A995-8F2136C1311A}"/>
                     <w:text/>
                   </w:sdtPr>
+                  <w:sdtEndPr/>
                   <w:sdtContent>
                     <w:tc>
                       <w:tcPr>
@@ -2261,7 +2338,7 @@
           <w:tcPr>
             <w:tcW w:w="2614" w:type="dxa"/>
             <w:tcBorders>
-              <w:bottom w:val="single" w:sz="4" w:space="0" w:color="auto"/>
+              <w:bottom w:val="single" w:color="auto" w:sz="4" w:space="0"/>
             </w:tcBorders>
           </w:tcPr>
           <w:p>
@@ -2277,7 +2354,7 @@
           <w:tcPr>
             <w:tcW w:w="2614" w:type="dxa"/>
             <w:tcBorders>
-              <w:bottom w:val="single" w:sz="4" w:space="0" w:color="auto"/>
+              <w:bottom w:val="single" w:color="auto" w:sz="4" w:space="0"/>
             </w:tcBorders>
           </w:tcPr>
           <w:p>
@@ -2293,7 +2370,7 @@
           <w:tcPr>
             <w:tcW w:w="2614" w:type="dxa"/>
             <w:tcBorders>
-              <w:bottom w:val="single" w:sz="4" w:space="0" w:color="auto"/>
+              <w:bottom w:val="single" w:color="auto" w:sz="4" w:space="0"/>
             </w:tcBorders>
           </w:tcPr>
           <w:p>
@@ -2309,7 +2386,7 @@
           <w:tcPr>
             <w:tcW w:w="2614" w:type="dxa"/>
             <w:tcBorders>
-              <w:bottom w:val="single" w:sz="4" w:space="0" w:color="auto"/>
+              <w:bottom w:val="single" w:color="auto" w:sz="4" w:space="0"/>
             </w:tcBorders>
           </w:tcPr>
           <w:p>
@@ -2344,13 +2421,14 @@
             <w:dataBinding w:prefixMappings="xmlns:ns0='urn:microsoft-dynamics-nav/reports/NPR_CRO_Fiscal_Bill_A4/6014554/' " w:xpath="/ns0:NavWordReportXmlPart[1]/ns0:Labels[1]/ns0:TotalLbl[1]" w:storeItemID="{974C08F4-FF06-4D7D-A995-8F2136C1311A}"/>
             <w:text/>
           </w:sdtPr>
+          <w:sdtEndPr/>
           <w:sdtContent>
             <w:tc>
               <w:tcPr>
                 <w:tcW w:w="2614" w:type="dxa"/>
                 <w:tcBorders>
-                  <w:top w:val="single" w:sz="4" w:space="0" w:color="auto"/>
-                  <w:bottom w:val="single" w:sz="4" w:space="0" w:color="auto"/>
+                  <w:top w:val="single" w:color="auto" w:sz="4" w:space="0"/>
+                  <w:bottom w:val="single" w:color="auto" w:sz="4" w:space="0"/>
                 </w:tcBorders>
               </w:tcPr>
               <w:p>
@@ -2379,8 +2457,8 @@
           <w:tcPr>
             <w:tcW w:w="2614" w:type="dxa"/>
             <w:tcBorders>
-              <w:top w:val="single" w:sz="4" w:space="0" w:color="auto"/>
-              <w:bottom w:val="single" w:sz="4" w:space="0" w:color="auto"/>
+              <w:top w:val="single" w:color="auto" w:sz="4" w:space="0"/>
+              <w:bottom w:val="single" w:color="auto" w:sz="4" w:space="0"/>
             </w:tcBorders>
           </w:tcPr>
           <w:p>
@@ -2396,8 +2474,8 @@
           <w:tcPr>
             <w:tcW w:w="2614" w:type="dxa"/>
             <w:tcBorders>
-              <w:top w:val="single" w:sz="4" w:space="0" w:color="auto"/>
-              <w:bottom w:val="single" w:sz="4" w:space="0" w:color="auto"/>
+              <w:top w:val="single" w:color="auto" w:sz="4" w:space="0"/>
+              <w:bottom w:val="single" w:color="auto" w:sz="4" w:space="0"/>
             </w:tcBorders>
           </w:tcPr>
           <w:p>
@@ -2426,13 +2504,14 @@
             <w:dataBinding w:prefixMappings="xmlns:ns0='urn:microsoft-dynamics-nav/reports/NPR_CRO_Fiscal_Bill_A4/6014554/' " w:xpath="/ns0:NavWordReportXmlPart[1]/ns0:CROPOSAuditLogAuxInfo[1]/ns0:CROTotals[1]/ns0:CRO_TotalVATAmount[1]" w:storeItemID="{974C08F4-FF06-4D7D-A995-8F2136C1311A}"/>
             <w:text/>
           </w:sdtPr>
+          <w:sdtEndPr/>
           <w:sdtContent>
             <w:tc>
               <w:tcPr>
                 <w:tcW w:w="2614" w:type="dxa"/>
                 <w:tcBorders>
-                  <w:top w:val="single" w:sz="4" w:space="0" w:color="auto"/>
-                  <w:bottom w:val="single" w:sz="4" w:space="0" w:color="auto"/>
+                  <w:top w:val="single" w:color="auto" w:sz="4" w:space="0"/>
+                  <w:bottom w:val="single" w:color="auto" w:sz="4" w:space="0"/>
                 </w:tcBorders>
               </w:tcPr>
               <w:p>
@@ -2473,12 +2552,12 @@
         <w:tblStyle w:val="TableGrid"/>
         <w:tblW w:w="0" w:type="auto"/>
         <w:tblBorders>
-          <w:top w:val="none" w:sz="0" w:space="0" w:color="auto"/>
-          <w:left w:val="none" w:sz="0" w:space="0" w:color="auto"/>
-          <w:bottom w:val="none" w:sz="0" w:space="0" w:color="auto"/>
-          <w:right w:val="none" w:sz="0" w:space="0" w:color="auto"/>
-          <w:insideH w:val="none" w:sz="0" w:space="0" w:color="auto"/>
-          <w:insideV w:val="none" w:sz="0" w:space="0" w:color="auto"/>
+          <w:top w:val="none" w:color="auto" w:sz="0" w:space="0"/>
+          <w:left w:val="none" w:color="auto" w:sz="0" w:space="0"/>
+          <w:bottom w:val="none" w:color="auto" w:sz="0" w:space="0"/>
+          <w:right w:val="none" w:color="auto" w:sz="0" w:space="0"/>
+          <w:insideH w:val="none" w:color="auto" w:sz="0" w:space="0"/>
+          <w:insideV w:val="none" w:color="auto" w:sz="0" w:space="0"/>
         </w:tblBorders>
         <w:tblLook w:val="04A0" w:firstRow="1" w:lastRow="0" w:firstColumn="1" w:lastColumn="0" w:noHBand="0" w:noVBand="1"/>
       </w:tblPr>
@@ -2502,6 +2581,7 @@
             <w:dataBinding w:prefixMappings="xmlns:ns0='urn:microsoft-dynamics-nav/reports/NPR_CRO_Fiscal_Bill_A4/6014554/' " w:xpath="/ns0:NavWordReportXmlPart[1]/ns0:Labels[1]/ns0:ZKILbl[1]" w:storeItemID="{974C08F4-FF06-4D7D-A995-8F2136C1311A}"/>
             <w:text/>
           </w:sdtPr>
+          <w:sdtEndPr/>
           <w:sdtContent>
             <w:tc>
               <w:tcPr>
@@ -2540,6 +2620,7 @@
             <w:dataBinding w:prefixMappings="xmlns:ns0='urn:microsoft-dynamics-nav/reports/NPR_CRO_Fiscal_Bill_A4/6014554/' " w:xpath="/ns0:NavWordReportXmlPart[1]/ns0:CROPOSAuditLogAuxInfo[1]/ns0:CRO_ZKICode[1]" w:storeItemID="{974C08F4-FF06-4D7D-A995-8F2136C1311A}"/>
             <w:text/>
           </w:sdtPr>
+          <w:sdtEndPr/>
           <w:sdtContent>
             <w:tc>
               <w:tcPr>
@@ -2583,6 +2664,7 @@
             <w:dataBinding w:prefixMappings="xmlns:ns0='urn:microsoft-dynamics-nav/reports/NPR_CRO_Fiscal_Bill_A4/6014554/' " w:xpath="/ns0:NavWordReportXmlPart[1]/ns0:Labels[1]/ns0:JIRLbl[1]" w:storeItemID="{974C08F4-FF06-4D7D-A995-8F2136C1311A}"/>
             <w:text/>
           </w:sdtPr>
+          <w:sdtEndPr/>
           <w:sdtContent>
             <w:tc>
               <w:tcPr>
@@ -2623,6 +2705,7 @@
             <w:dataBinding w:prefixMappings="xmlns:ns0='urn:microsoft-dynamics-nav/reports/NPR_CRO_Fiscal_Bill_A4/6014554/' " w:xpath="/ns0:NavWordReportXmlPart[1]/ns0:CROPOSAuditLogAuxInfo[1]/ns0:CRO_JIRCode[1]" w:storeItemID="{974C08F4-FF06-4D7D-A995-8F2136C1311A}"/>
             <w:text/>
           </w:sdtPr>
+          <w:sdtEndPr/>
           <w:sdtContent>
             <w:tc>
               <w:tcPr>
@@ -2669,6 +2752,7 @@
             <w:dataBinding w:prefixMappings="xmlns:ns0='urn:microsoft-dynamics-nav/reports/NPR_CRO_Fiscal_Bill_A4/6014554/' " w:xpath="/ns0:NavWordReportXmlPart[1]/ns0:Labels[1]/ns0:CurrencyLbl[1]" w:storeItemID="{974C08F4-FF06-4D7D-A995-8F2136C1311A}"/>
             <w:text/>
           </w:sdtPr>
+          <w:sdtEndPr/>
           <w:sdtContent>
             <w:tc>
               <w:tcPr>
@@ -2718,6 +2802,7 @@
             <w:dataBinding w:prefixMappings="xmlns:ns0='urn:microsoft-dynamics-nav/reports/NPR_CRO_Fiscal_Bill_A4/6014554/' " w:xpath="/ns0:NavWordReportXmlPart[1]/ns0:CROPOSAuditLogAuxInfo[1]/ns0:CRO_QRCode[1]" w:storeItemID="{974C08F4-FF06-4D7D-A995-8F2136C1311A}"/>
             <w:text/>
           </w:sdtPr>
+          <w:sdtEndPr/>
           <w:sdtContent>
             <w:tc>
               <w:tcPr>
@@ -2818,18 +2903,18 @@
 </file>
 
 <file path=word/header1.xml><?xml version="1.0" encoding="utf-8"?>
-<w:hdr xmlns:wpc="http://schemas.microsoft.com/office/word/2010/wordprocessingCanvas" xmlns:cx="http://schemas.microsoft.com/office/drawing/2014/chartex" xmlns:cx1="http://schemas.microsoft.com/office/drawing/2015/9/8/chartex" xmlns:cx2="http://schemas.microsoft.com/office/drawing/2015/10/21/chartex" xmlns:cx3="http://schemas.microsoft.com/office/drawing/2016/5/9/chartex" xmlns:cx4="http://schemas.microsoft.com/office/drawing/2016/5/10/chartex" xmlns:cx5="http://schemas.microsoft.com/office/drawing/2016/5/11/chartex" xmlns:cx6="http://schemas.microsoft.com/office/drawing/2016/5/12/chartex" xmlns:cx7="http://schemas.microsoft.com/office/drawing/2016/5/13/chartex" xmlns:cx8="http://schemas.microsoft.com/office/drawing/2016/5/14/chartex" xmlns:mc="http://schemas.openxmlformats.org/markup-compatibility/2006" xmlns:aink="http://schemas.microsoft.com/office/drawing/2016/ink" xmlns:am3d="http://schemas.microsoft.com/office/drawing/2017/model3d" xmlns:o="urn:schemas-microsoft-com:office:office" xmlns:oel="http://schemas.microsoft.com/office/2019/extlst" xmlns:r="http://schemas.openxmlformats.org/officeDocument/2006/relationships" xmlns:m="http://schemas.openxmlformats.org/officeDocument/2006/math" xmlns:v="urn:schemas-microsoft-com:vml" xmlns:wp14="http://schemas.microsoft.com/office/word/2010/wordprocessingDrawing" xmlns:wp="http://schemas.openxmlformats.org/drawingml/2006/wordprocessingDrawing" xmlns:w10="urn:schemas-microsoft-com:office:word" xmlns:w="http://schemas.openxmlformats.org/wordprocessingml/2006/main" xmlns:w14="http://schemas.microsoft.com/office/word/2010/wordml" xmlns:w15="http://schemas.microsoft.com/office/word/2012/wordml" xmlns:w16cex="http://schemas.microsoft.com/office/word/2018/wordml/cex" xmlns:w16cid="http://schemas.microsoft.com/office/word/2016/wordml/cid" xmlns:w16="http://schemas.microsoft.com/office/word/2018/wordml" xmlns:w16du="http://schemas.microsoft.com/office/word/2023/wordml/word16du" xmlns:w16sdtdh="http://schemas.microsoft.com/office/word/2020/wordml/sdtdatahash" xmlns:w16sdtfl="http://schemas.microsoft.com/office/word/2024/wordml/sdtformatlock" xmlns:w16se="http://schemas.microsoft.com/office/word/2015/wordml/symex" xmlns:wpg="http://schemas.microsoft.com/office/word/2010/wordprocessingGroup" xmlns:wpi="http://schemas.microsoft.com/office/word/2010/wordprocessingInk" xmlns:wne="http://schemas.microsoft.com/office/word/2006/wordml" xmlns:wps="http://schemas.microsoft.com/office/word/2010/wordprocessingShape" mc:Ignorable="w14 w15 w16se w16cid w16 w16cex w16sdtdh w16sdtfl w16du wp14">
+<w:hdr xmlns:a="http://schemas.openxmlformats.org/drawingml/2006/main" xmlns:pic="http://schemas.openxmlformats.org/drawingml/2006/picture" xmlns:a14="http://schemas.microsoft.com/office/drawing/2010/main" xmlns:wpc="http://schemas.microsoft.com/office/word/2010/wordprocessingCanvas" xmlns:cx="http://schemas.microsoft.com/office/drawing/2014/chartex" xmlns:cx1="http://schemas.microsoft.com/office/drawing/2015/9/8/chartex" xmlns:cx2="http://schemas.microsoft.com/office/drawing/2015/10/21/chartex" xmlns:cx3="http://schemas.microsoft.com/office/drawing/2016/5/9/chartex" xmlns:cx4="http://schemas.microsoft.com/office/drawing/2016/5/10/chartex" xmlns:cx5="http://schemas.microsoft.com/office/drawing/2016/5/11/chartex" xmlns:cx6="http://schemas.microsoft.com/office/drawing/2016/5/12/chartex" xmlns:cx7="http://schemas.microsoft.com/office/drawing/2016/5/13/chartex" xmlns:cx8="http://schemas.microsoft.com/office/drawing/2016/5/14/chartex" xmlns:mc="http://schemas.openxmlformats.org/markup-compatibility/2006" xmlns:aink="http://schemas.microsoft.com/office/drawing/2016/ink" xmlns:am3d="http://schemas.microsoft.com/office/drawing/2017/model3d" xmlns:o="urn:schemas-microsoft-com:office:office" xmlns:oel="http://schemas.microsoft.com/office/2019/extlst" xmlns:r="http://schemas.openxmlformats.org/officeDocument/2006/relationships" xmlns:m="http://schemas.openxmlformats.org/officeDocument/2006/math" xmlns:v="urn:schemas-microsoft-com:vml" xmlns:wp14="http://schemas.microsoft.com/office/word/2010/wordprocessingDrawing" xmlns:wp="http://schemas.openxmlformats.org/drawingml/2006/wordprocessingDrawing" xmlns:w10="urn:schemas-microsoft-com:office:word" xmlns:w="http://schemas.openxmlformats.org/wordprocessingml/2006/main" xmlns:w14="http://schemas.microsoft.com/office/word/2010/wordml" xmlns:w15="http://schemas.microsoft.com/office/word/2012/wordml" xmlns:w16cex="http://schemas.microsoft.com/office/word/2018/wordml/cex" xmlns:w16cid="http://schemas.microsoft.com/office/word/2016/wordml/cid" xmlns:w16="http://schemas.microsoft.com/office/word/2018/wordml" xmlns:w16du="http://schemas.microsoft.com/office/word/2023/wordml/word16du" xmlns:w16sdtdh="http://schemas.microsoft.com/office/word/2020/wordml/sdtdatahash" xmlns:w16sdtfl="http://schemas.microsoft.com/office/word/2024/wordml/sdtformatlock" xmlns:w16se="http://schemas.microsoft.com/office/word/2015/wordml/symex" xmlns:wpg="http://schemas.microsoft.com/office/word/2010/wordprocessingGroup" xmlns:wpi="http://schemas.microsoft.com/office/word/2010/wordprocessingInk" xmlns:wne="http://schemas.microsoft.com/office/word/2006/wordml" xmlns:wps="http://schemas.microsoft.com/office/word/2010/wordprocessingShape" mc:Ignorable="w14 w15 w16se w16cid w16 w16cex w16sdtdh w16sdtfl w16du wp14">
   <w:tbl>
     <w:tblPr>
       <w:tblStyle w:val="TableGrid"/>
       <w:tblW w:w="0" w:type="auto"/>
       <w:tblBorders>
-        <w:top w:val="none" w:sz="0" w:space="0" w:color="auto"/>
-        <w:left w:val="none" w:sz="0" w:space="0" w:color="auto"/>
-        <w:bottom w:val="none" w:sz="0" w:space="0" w:color="auto"/>
-        <w:right w:val="none" w:sz="0" w:space="0" w:color="auto"/>
-        <w:insideH w:val="none" w:sz="0" w:space="0" w:color="auto"/>
-        <w:insideV w:val="none" w:sz="0" w:space="0" w:color="auto"/>
+        <w:top w:val="none" w:color="auto" w:sz="0" w:space="0"/>
+        <w:left w:val="none" w:color="auto" w:sz="0" w:space="0"/>
+        <w:bottom w:val="none" w:color="auto" w:sz="0" w:space="0"/>
+        <w:right w:val="none" w:color="auto" w:sz="0" w:space="0"/>
+        <w:insideH w:val="none" w:color="auto" w:sz="0" w:space="0"/>
+        <w:insideV w:val="none" w:color="auto" w:sz="0" w:space="0"/>
       </w:tblBorders>
       <w:tblLook w:val="04A0" w:firstRow="1" w:lastRow="0" w:firstColumn="1" w:lastColumn="0" w:noHBand="0" w:noVBand="1"/>
     </w:tblPr>
@@ -2857,6 +2942,7 @@
           <w:dataBinding w:prefixMappings="xmlns:ns0='urn:microsoft-dynamics-nav/reports/NPR_CRO_Fiscal_Bill_A4/6014554/' " w:xpath="/ns0:NavWordReportXmlPart[1]/ns0:CompanyInformation[1]/ns0:CRO_Company_Name[1]" w:storeItemID="{974C08F4-FF06-4D7D-A995-8F2136C1311A}"/>
           <w:text/>
         </w:sdtPr>
+        <w:sdtEndPr/>
         <w:sdtContent>
           <w:tc>
             <w:tcPr>
@@ -2899,6 +2985,7 @@
           <w:dataBinding w:prefixMappings="xmlns:ns0='urn:microsoft-dynamics-nav/reports/NPR_CRO_Fiscal_Bill_A4/6014554/' " w:xpath="/ns0:NavWordReportXmlPart[1]/ns0:CompanyInformation[1]/ns0:CRO_Company_Picture[1]" w:storeItemID="{974C08F4-FF06-4D7D-A995-8F2136C1311A}"/>
           <w:picture/>
         </w:sdtPr>
+        <w:sdtEndPr/>
         <w:sdtContent>
           <w:tc>
             <w:tcPr>
@@ -2983,6 +3070,7 @@
           <w:dataBinding w:prefixMappings="xmlns:ns0='urn:microsoft-dynamics-nav/reports/NPR_CRO_Fiscal_Bill_A4/6014554/' " w:xpath="/ns0:NavWordReportXmlPart[1]/ns0:CompanyInformation[1]/ns0:CRO_Company_InformationBlock[1]" w:storeItemID="{974C08F4-FF06-4D7D-A995-8F2136C1311A}"/>
           <w:text/>
         </w:sdtPr>
+        <w:sdtEndPr/>
         <w:sdtContent>
           <w:tc>
             <w:tcPr>
@@ -3993,8 +4081,10 @@
   </w:compat>
   <w:rsids>
     <w:rsidRoot w:val="00CE7381"/>
+    <w:rsid w:val="0009626F"/>
     <w:rsid w:val="000C5B9C"/>
     <w:rsid w:val="00105F7A"/>
+    <w:rsid w:val="0015225A"/>
     <w:rsid w:val="001933BC"/>
     <w:rsid w:val="00203C81"/>
     <w:rsid w:val="00277001"/>
@@ -4003,24 +4093,36 @@
     <w:rsid w:val="00320405"/>
     <w:rsid w:val="00385DB1"/>
     <w:rsid w:val="004252C6"/>
+    <w:rsid w:val="00427162"/>
     <w:rsid w:val="0044470D"/>
     <w:rsid w:val="006207C5"/>
     <w:rsid w:val="0069749B"/>
+    <w:rsid w:val="008161B0"/>
     <w:rsid w:val="00852AA6"/>
+    <w:rsid w:val="00866253"/>
     <w:rsid w:val="00895926"/>
     <w:rsid w:val="009A5B2D"/>
+    <w:rsid w:val="00A021AF"/>
     <w:rsid w:val="00A236DC"/>
     <w:rsid w:val="00A27CF2"/>
     <w:rsid w:val="00A3640C"/>
     <w:rsid w:val="00AD674B"/>
+    <w:rsid w:val="00AF059F"/>
+    <w:rsid w:val="00B138CD"/>
     <w:rsid w:val="00B2015F"/>
     <w:rsid w:val="00B36E8A"/>
     <w:rsid w:val="00B740E8"/>
+    <w:rsid w:val="00C13F6A"/>
+    <w:rsid w:val="00C16609"/>
     <w:rsid w:val="00C37625"/>
     <w:rsid w:val="00CB1412"/>
     <w:rsid w:val="00CE7381"/>
+    <w:rsid w:val="00D0100C"/>
+    <w:rsid w:val="00D14B6E"/>
     <w:rsid w:val="00D21066"/>
+    <w:rsid w:val="00DE78B6"/>
     <w:rsid w:val="00E00744"/>
+    <w:rsid w:val="00E61FFC"/>
   </w:rsids>
   <m:mathPr>
     <m:mathFont m:val="Cambria Math"/>
@@ -4854,7 +4956,27 @@
 </a:theme>
 </file>
 
-<file path=customXml/item1.xml>��< ? x m l   v e r s i o n = " 1 . 0 "   e n c o d i n g = " u t f - 1 6 " ? > < N a v W o r d R e p o r t X m l P a r t   x m l n s = " u r n : m i c r o s o f t - d y n a m i c s - n a v / r e p o r t s / N P R _ C R O _ F i s c a l _ B i l l _ A 4 / 6 0 1 4 5 5 4 / " > +<file path=word/webextensions/taskpanes.xml><?xml version="1.0" encoding="utf-8"?>
+<wetp:taskpanes xmlns:wetp="http://schemas.microsoft.com/office/webextensions/taskpanes/2010/11">
+  <wetp:taskpane dockstate="right" visibility="0" width="350" row="1">
+    <wetp:webextensionref xmlns:r="http://schemas.openxmlformats.org/officeDocument/2006/relationships" r:id="rId1"/>
+  </wetp:taskpane>
+</wetp:taskpanes>
+</file>
+
+<file path=word/webextensions/webextension1.xml><?xml version="1.0" encoding="utf-8"?>
+<we:webextension xmlns:we="http://schemas.microsoft.com/office/webextensions/webextension/2010/11" id="{97DC1D30-F32E-44C3-A54D-7AA7CE9C9C1C}">
+  <we:reference id="89a176cd-6ad0-47c4-b661-0a746d7d62c5" version="2.0.0.1" store="EXCatalog" storeType="EXCatalog"/>
+  <we:alternateReferences>
+    <we:reference id="WA200007356" version="2.0.0.1" store="da-DK" storeType="OMEX"/>
+  </we:alternateReferences>
+  <we:properties/>
+  <we:bindings/>
+  <we:snapshot xmlns:r="http://schemas.openxmlformats.org/officeDocument/2006/relationships"/>
+</we:webextension>
+</file>
+
+<file path=customXml/item1.xml>��< ? x m l   v e r s i o n = " 1 . 0 "   e n c o d i n g = " u t f - 1 6 " ? > < N a v W o r d R e p o r t X m l P a r t   x m l n s = " u r n : m i c r o s o f t - d y n a m i c s - b u s i n e s s c e n t r a l / i n t e r n a l / e x t e n d e d / r e p o r t s / N P R _ C R O _ F i s c a l _ B i l l _ A 4 / 6 0 1 4 5 5 4 / " >   
      < B C R e p o r t I n f o r m a t i o n >   
@@ -4922,139 +5044,143 @@
  
      < L a b e l s >   
-         < C u r r e n c y L b l > C u r r e n c y L b l < / C u r r e n c y L b l > - 
-         < D i s c o u n t L b l > D i s c o u n t L b l < / D i s c o u n t L b l > - 
-         < I t e m N a m e L b l > I t e m N a m e L b l < / I t e m N a m e L b l > - 
-         < I t e m N o L b l > I t e m N o L b l < / I t e m N o L b l > - 
-         < J I R L b l > J I R L b l < / J I R L b l > - 
-         < P a y m e n t M e t h o d L b l > P a y m e n t M e t h o d L b l < / P a y m e n t M e t h o d L b l > - 
-         < P e r c L b l > P e r c L b l < / P e r c L b l > - 
-         < P r i c e L b l > P r i c e L b l < / P r i c e L b l > - 
-         < Q t y L b l > Q t y L b l < / Q t y L b l > - 
-         < T a x A m o u n t L b l > T a x A m o u n t L b l < / T a x A m o u n t L b l > - 
-         < T a x B a s e L b l > T a x B a s e L b l < / T a x B a s e L b l > - 
-         < T a x L b l > T a x L b l < / T a x L b l > - 
-         < T a x R a t e L b l > T a x R a t e L b l < / T a x R a t e L b l > - 
-         < T o P a y L b l > T o P a y L b l < / T o P a y L b l > - 
-         < T o t a l L b l > T o t a l L b l < / T o t a l L b l > - 
-         < U o M L b l > U o M L b l < / U o M L b l > - 
-         < V A T L b l > V A T L b l < / V A T L b l > - 
-         < Z K I L b l > Z K I L b l < / Z K I L b l > +         < C u r r e n c y L b l   E l e m e n t T y p e = " P a r a m e t e r "   E l e m e n t I d = " 1 1 6 2 5 3 0 8 4 8 "   D a t a T y p e = " S t r i n g " > C u r r e n c y L b l < / C u r r e n c y L b l > + 
+         < D i s c o u n t L b l   E l e m e n t T y p e = " P a r a m e t e r "   E l e m e n t I d = " 2 9 0 6 6 1 1 1 8 "   D a t a T y p e = " S t r i n g " > D i s c o u n t L b l < / D i s c o u n t L b l > + 
+         < I t e m N a m e L b l   E l e m e n t T y p e = " P a r a m e t e r "   E l e m e n t I d = " 8 8 8 8 3 5 0 9 3 "   D a t a T y p e = " S t r i n g " > I t e m N a m e L b l < / I t e m N a m e L b l > + 
+         < I t e m N o L b l   E l e m e n t T y p e = " P a r a m e t e r "   E l e m e n t I d = " 1 7 9 0 6 2 1 1 1 5 "   D a t a T y p e = " S t r i n g " > I t e m N o L b l < / I t e m N o L b l > + 
+         < J I R L b l   E l e m e n t T y p e = " P a r a m e t e r "   E l e m e n t I d = " 1 8 9 2 1 0 9 9 3 4 "   D a t a T y p e = " S t r i n g " > J I R L b l < / J I R L b l > + 
+         < P a y m e n t M e t h o d L b l   E l e m e n t T y p e = " P a r a m e t e r "   E l e m e n t I d = " 2 0 6 0 2 7 8 2 7 4 "   D a t a T y p e = " S t r i n g " > P a y m e n t M e t h o d L b l < / P a y m e n t M e t h o d L b l > + 
+         < P e r c L b l   E l e m e n t T y p e = " P a r a m e t e r "   E l e m e n t I d = " 1 2 0 3 7 6 1 7 2 3 "   D a t a T y p e = " S t r i n g " > P e r c L b l < / P e r c L b l > + 
+         < P r i c e L b l   E l e m e n t T y p e = " P a r a m e t e r "   E l e m e n t I d = " 1 6 4 2 8 6 2 9 7 8 "   D a t a T y p e = " S t r i n g " > P r i c e L b l < / P r i c e L b l > + 
+         < Q t y L b l   E l e m e n t T y p e = " P a r a m e t e r "   E l e m e n t I d = " 1 1 1 2 3 4 7 3 2 3 "   D a t a T y p e = " S t r i n g " > Q t y L b l < / Q t y L b l > + 
+         < T a x A m o u n t L b l   E l e m e n t T y p e = " P a r a m e t e r "   E l e m e n t I d = " 2 1 2 1 8 8 1 8 5 8 "   D a t a T y p e = " S t r i n g " > T a x A m o u n t L b l < / T a x A m o u n t L b l > + 
+         < T a x B a s e L b l   E l e m e n t T y p e = " P a r a m e t e r "   E l e m e n t I d = " 1 7 2 5 1 6 4 1 9 1 "   D a t a T y p e = " S t r i n g " > T a x B a s e L b l < / T a x B a s e L b l > + 
+         < T a x L b l   E l e m e n t T y p e = " P a r a m e t e r "   E l e m e n t I d = " 3 2 0 6 8 2 1 1 0 "   D a t a T y p e = " S t r i n g " > T a x L b l < / T a x L b l > + 
+         < T a x R a t e L b l   E l e m e n t T y p e = " P a r a m e t e r "   E l e m e n t I d = " 1 2 1 0 7 0 0 5 4 4 "   D a t a T y p e = " S t r i n g " > T a x R a t e L b l < / T a x R a t e L b l > + 
+         < T o P a y L b l   E l e m e n t T y p e = " P a r a m e t e r "   E l e m e n t I d = " 1 3 4 8 2 0 8 9 8 8 "   D a t a T y p e = " S t r i n g " > T o P a y L b l < / T o P a y L b l > + 
+         < T o t a l L b l   E l e m e n t T y p e = " P a r a m e t e r "   E l e m e n t I d = " 2 6 2 6 5 4 8 3 7 "   D a t a T y p e = " S t r i n g " > T o t a l L b l < / T o t a l L b l > + 
+         < U o M L b l   E l e m e n t T y p e = " P a r a m e t e r "   E l e m e n t I d = " 7 3 6 2 1 6 7 6 0 "   D a t a T y p e = " S t r i n g " > U o M L b l < / U o M L b l > + 
+         < V A T L b l   E l e m e n t T y p e = " P a r a m e t e r "   E l e m e n t I d = " 4 7 0 2 7 2 7 4 8 "   D a t a T y p e = " S t r i n g " > V A T L b l < / V A T L b l > + 
+         < Z K I L b l   E l e m e n t T y p e = " P a r a m e t e r "   E l e m e n t I d = " 1 6 2 9 3 4 8 5 6 7 "   D a t a T y p e = " S t r i n g " > Z K I L b l < / Z K I L b l >   
      < / L a b e l s >   
-     < C o m p a n y I n f o r m a t i o n > - 
-         < C R O _ C o m p a n y _ A d d r e s s > C R O _ C o m p a n y _ A d d r e s s < / C R O _ C o m p a n y _ A d d r e s s > - 
-         < C R O _ C o m p a n y _ E m a i l > C R O _ C o m p a n y _ E m a i l < / C R O _ C o m p a n y _ E m a i l > - 
-         < C R O _ C o m p a n y _ H o m e P a g e > C R O _ C o m p a n y _ H o m e P a g e < / C R O _ C o m p a n y _ H o m e P a g e > - 
-         < C R O _ C o m p a n y _ I n f o r m a t i o n B l o c k > C R O _ C o m p a n y _ I n f o r m a t i o n B l o c k < / C R O _ C o m p a n y _ I n f o r m a t i o n B l o c k > - 
-         < C R O _ C o m p a n y _ N a m e > C R O _ C o m p a n y _ N a m e < / C R O _ C o m p a n y _ N a m e > - 
-         < C R O _ C o m p a n y _ P h o n e N o > C R O _ C o m p a n y _ P h o n e N o < / C R O _ C o m p a n y _ P h o n e N o > - 
-         < C R O _ C o m p a n y _ P i c t u r e / > - 
-         < C R O _ C o m p a n y _ V A T R e g N o > C R O _ C o m p a n y _ V A T R e g N o < / C R O _ C o m p a n y _ V A T R e g N o > +     < T o o l t i p s / > + 
+     < C o m p a n y I n f o r m a t i o n   E l e m e n t T y p e = " D a t a I t e m "   E l e m e n t I d = " 1 5 5 6 1 4 5 1 5 4 " > + 
+         < C R O _ C o m p a n y _ A d d r e s s   E l e m e n t T y p e = " C o l u m n "   E l e m e n t I d = " 1 3 6 7 8 4 5 4 0 2 "   D a t a T y p e = " T e x t " > C R O _ C o m p a n y _ A d d r e s s < / C R O _ C o m p a n y _ A d d r e s s > + 
+         < C R O _ C o m p a n y _ E m a i l   E l e m e n t T y p e = " C o l u m n "   E l e m e n t I d = " 4 1 8 7 6 7 8 3 2 "   D a t a T y p e = " T e x t " > C R O _ C o m p a n y _ E m a i l < / C R O _ C o m p a n y _ E m a i l > + 
+         < C R O _ C o m p a n y _ H o m e P a g e   E l e m e n t T y p e = " C o l u m n "   E l e m e n t I d = " 1 0 6 7 7 6 5 2 5 6 "   D a t a T y p e = " T e x t " > C R O _ C o m p a n y _ H o m e P a g e < / C R O _ C o m p a n y _ H o m e P a g e > + 
+         < C R O _ C o m p a n y _ I n f o r m a t i o n B l o c k   E l e m e n t T y p e = " C o l u m n "   E l e m e n t I d = " 1 8 3 7 7 9 1 6 5 5 "   D a t a T y p e = " T e x t " > C R O _ C o m p a n y _ I n f o r m a t i o n B l o c k < / C R O _ C o m p a n y _ I n f o r m a t i o n B l o c k > + 
+         < C R O _ C o m p a n y _ N a m e   E l e m e n t T y p e = " C o l u m n "   E l e m e n t I d = " 1 3 5 7 1 4 8 2 0 5 "   D a t a T y p e = " T e x t " > C R O _ C o m p a n y _ N a m e < / C R O _ C o m p a n y _ N a m e > + 
+         < C R O _ C o m p a n y _ P h o n e N o   E l e m e n t T y p e = " C o l u m n "   E l e m e n t I d = " 2 3 3 3 6 4 9 4 5 "   D a t a T y p e = " T e x t " > C R O _ C o m p a n y _ P h o n e N o < / C R O _ C o m p a n y _ P h o n e N o > + 
+         < C R O _ C o m p a n y _ P i c t u r e   E l e m e n t T y p e = " C o l u m n "   E l e m e n t I d = " 2 0 9 5 4 5 3 3 4 4 "   D a t a T y p e = " B l o b " / > + 
+         < C R O _ C o m p a n y _ V A T R e g N o   E l e m e n t T y p e = " C o l u m n "   E l e m e n t I d = " 6 3 9 2 3 8 4 4 6 "   D a t a T y p e = " T e x t " > C R O _ C o m p a n y _ V A T R e g N o < / C R O _ C o m p a n y _ V A T R e g N o >   
      < / C o m p a n y I n f o r m a t i o n >   
-     < C R O P O S A u d i t L o g A u x I n f o > - 
-         < C R O _ B i l l N o > C R O _ B i l l N o < / C R O _ B i l l N o > - 
-         < C R O _ B i l l _ D a t e T i m e > C R O _ B i l l _ D a t e T i m e < / C R O _ B i l l _ D a t e T i m e > - 
-         < C R O _ C o p y T e x t > C R O _ C o p y T e x t < / C R O _ C o p y T e x t > - 
-         < C R O _ J I R C o d e > C R O _ J I R C o d e < / C R O _ J I R C o d e > - 
-         < C R O _ Q R C o d e > C R O _ Q R C o d e < / C R O _ Q R C o d e > - 
-         < C R O _ T o t a l A m o u n t > C R O _ T o t a l A m o u n t < / C R O _ T o t a l A m o u n t > - 
-         < C R O _ Z K I C o d e > C R O _ Z K I C o d e < / C R O _ Z K I C o d e > - 
-         < C u s t o m e r > - 
-             < C R O _ C u s t o m e r _ I n f o r m a t i o n B l o c k > C R O _ C u s t o m e r _ I n f o r m a t i o n B l o c k < / C R O _ C u s t o m e r _ I n f o r m a t i o n B l o c k > +     < C R O P O S A u d i t L o g A u x I n f o   E l e m e n t T y p e = " D a t a I t e m "   E l e m e n t I d = " 1 6 9 9 8 0 1 3 2 " > + 
+         < C R O _ B i l l N o   E l e m e n t T y p e = " C o l u m n "   E l e m e n t I d = " 1 2 5 7 3 1 3 9 9 0 "   D a t a T y p e = " S t r i n g " > C R O _ B i l l N o < / C R O _ B i l l N o > + 
+         < C R O _ B i l l _ D a t e T i m e   E l e m e n t T y p e = " C o l u m n "   E l e m e n t I d = " 1 7 6 7 7 5 2 4 3 1 "   D a t a T y p e = " S t r i n g " > C R O _ B i l l _ D a t e T i m e < / C R O _ B i l l _ D a t e T i m e > + 
+         < C R O _ C o p y T e x t   E l e m e n t T y p e = " C o l u m n "   E l e m e n t I d = " 1 4 4 5 4 8 4 8 9 2 "   D a t a T y p e = " T e x t " > C R O _ C o p y T e x t < / C R O _ C o p y T e x t > + 
+         < C R O _ J I R C o d e   E l e m e n t T y p e = " C o l u m n "   E l e m e n t I d = " 7 0 5 7 1 4 1 9 2 "   D a t a T y p e = " T e x t " > C R O _ J I R C o d e < / C R O _ J I R C o d e > + 
+         < C R O _ Q R C o d e   E l e m e n t T y p e = " C o l u m n "   E l e m e n t I d = " 1 2 0 1 4 1 0 9 2 6 "   D a t a T y p e = " T e x t " > C R O _ Q R C o d e < / C R O _ Q R C o d e > + 
+         < C R O _ S o u r c e D o c u m e n t N o   E l e m e n t T y p e = " C o l u m n "   E l e m e n t I d = " 5 1 1 0 4 1 2 8 1 "   D a t a T y p e = " T e x t " > C R O _ S o u r c e D o c u m e n t N o < / C R O _ S o u r c e D o c u m e n t N o > + 
+         < C R O _ T o t a l A m o u n t   E l e m e n t T y p e = " C o l u m n "   E l e m e n t I d = " 1 1 5 3 9 3 8 3 8 6 "   D a t a T y p e = " D e c i m a l " > C R O _ T o t a l A m o u n t < / C R O _ T o t a l A m o u n t > + 
+         < C R O _ Z K I C o d e   E l e m e n t T y p e = " C o l u m n "   E l e m e n t I d = " 1 5 2 8 2 6 9 0 3 9 "   D a t a T y p e = " T e x t " > C R O _ Z K I C o d e < / C R O _ Z K I C o d e > + 
+         < C u s t o m e r   E l e m e n t T y p e = " D a t a I t e m "   E l e m e n t I d = " 1 5 2 5 1 9 1 9 9 " > + 
+             < C R O _ C u s t o m e r _ I n f o r m a t i o n B l o c k   E l e m e n t T y p e = " C o l u m n "   E l e m e n t I d = " 7 9 0 6 3 3 7 2 6 "   D a t a T y p e = " T e x t " > C R O _ C u s t o m e r _ I n f o r m a t i o n B l o c k < / C R O _ C u s t o m e r _ I n f o r m a t i o n B l o c k >   
          < / C u s t o m e r >   
-         < P O S S t o r e > - 
-             < C R O _ P O S S t o r e _ A d d r e s s > C R O _ P O S S t o r e _ A d d r e s s < / C R O _ P O S S t o r e _ A d d r e s s > - 
-             < C R O _ P O S S t o r e _ N a m e > C R O _ P O S S t o r e _ N a m e < / C R O _ P O S S t o r e _ N a m e > +         < P O S S t o r e   E l e m e n t T y p e = " D a t a I t e m "   E l e m e n t I d = " 1 6 6 4 3 5 2 5 8 6 " > + 
+             < C R O _ P O S S t o r e _ A d d r e s s   E l e m e n t T y p e = " C o l u m n "   E l e m e n t I d = " 3 9 8 1 4 4 6 7 4 "   D a t a T y p e = " T e x t " > C R O _ P O S S t o r e _ A d d r e s s < / C R O _ P O S S t o r e _ A d d r e s s > + 
+             < C R O _ P O S S t o r e _ N a m e   E l e m e n t T y p e = " C o l u m n "   E l e m e n t I d = " 1 4 8 7 6 0 5 9 6 1 "   D a t a T y p e = " T e x t " > C R O _ P O S S t o r e _ N a m e < / C R O _ P O S S t o r e _ N a m e >   
          < / P O S S t o r e >   
-         < P O S E n t r y S a l e s L i n e s > - 
-             < C R O _ A m o u n t I n c l u d i n g V A T > C R O _ A m o u n t I n c l u d i n g V A T < / C R O _ A m o u n t I n c l u d i n g V A T > - 
-             < C R O _ D i s c o u n t A m o u n t > C R O _ D i s c o u n t A m o u n t < / C R O _ D i s c o u n t A m o u n t > - 
-             < C R O _ D i s c o u n t P e r c > C R O _ D i s c o u n t P e r c < / C R O _ D i s c o u n t P e r c > - 
-             < C R O _ I t e m D e s c r i p t i o n > C R O _ I t e m D e s c r i p t i o n < / C R O _ I t e m D e s c r i p t i o n > - 
-             < C R O _ I t e m N o > C R O _ I t e m N o < / C R O _ I t e m N o > - 
-             < C R O _ Q u a n t i t y > C R O _ Q u a n t i t y < / C R O _ Q u a n t i t y > - 
-             < C R O _ S a l e s p e r s o n N a m e > C R O _ S a l e s p e r s o n N a m e < / C R O _ S a l e s p e r s o n N a m e > - 
-             < C R O _ U n i t P r i c e > C R O _ U n i t P r i c e < / C R O _ U n i t P r i c e > - 
-             < C R O _ U O M > C R O _ U O M < / C R O _ U O M > +         < P O S E n t r y S a l e s L i n e s   E l e m e n t T y p e = " D a t a I t e m "   E l e m e n t I d = " 9 6 3 7 9 4 9 6 8 " > + 
+             < C R O _ A m o u n t I n c l u d i n g V A T   E l e m e n t T y p e = " C o l u m n "   E l e m e n t I d = " 1 7 9 4 3 6 7 4 1 4 "   D a t a T y p e = " D e c i m a l " > C R O _ A m o u n t I n c l u d i n g V A T < / C R O _ A m o u n t I n c l u d i n g V A T > + 
+             < C R O _ D i s c o u n t A m o u n t   E l e m e n t T y p e = " C o l u m n "   E l e m e n t I d = " 1 7 5 3 9 4 0 8 7 5 "   D a t a T y p e = " T e x t " > C R O _ D i s c o u n t A m o u n t < / C R O _ D i s c o u n t A m o u n t > + 
+             < C R O _ D i s c o u n t P e r c   E l e m e n t T y p e = " C o l u m n "   E l e m e n t I d = " 1 9 9 6 4 9 6 9 7 9 "   D a t a T y p e = " T e x t " > C R O _ D i s c o u n t P e r c < / C R O _ D i s c o u n t P e r c > + 
+             < C R O _ I t e m D e s c r i p t i o n   E l e m e n t T y p e = " C o l u m n "   E l e m e n t I d = " 2 0 1 6 9 4 1 6 1 5 "   D a t a T y p e = " T e x t " > C R O _ I t e m D e s c r i p t i o n < / C R O _ I t e m D e s c r i p t i o n > + 
+             < C R O _ I t e m N o   E l e m e n t T y p e = " C o l u m n "   E l e m e n t I d = " 8 6 2 2 5 7 2 8 8 "   D a t a T y p e = " C o d e " > C R O _ I t e m N o < / C R O _ I t e m N o > + 
+             < C R O _ Q u a n t i t y   E l e m e n t T y p e = " C o l u m n "   E l e m e n t I d = " 3 5 0 4 0 5 5 9 9 "   D a t a T y p e = " D e c i m a l " > C R O _ Q u a n t i t y < / C R O _ Q u a n t i t y > + 
+             < C R O _ S a l e s p e r s o n N a m e   E l e m e n t T y p e = " C o l u m n "   E l e m e n t I d = " 7 8 2 1 4 0 2 9 8 "   D a t a T y p e = " T e x t " > C R O _ S a l e s p e r s o n N a m e < / C R O _ S a l e s p e r s o n N a m e > + 
+             < C R O _ U n i t P r i c e   E l e m e n t T y p e = " C o l u m n "   E l e m e n t I d = " 2 8 5 7 4 5 2 5 5 "   D a t a T y p e = " D e c i m a l " > C R O _ U n i t P r i c e < / C R O _ U n i t P r i c e > + 
+             < C R O _ U O M   E l e m e n t T y p e = " C o l u m n "   E l e m e n t I d = " 1 1 6 4 4 5 6 6 9 9 "   D a t a T y p e = " C o d e " > C R O _ U O M < / C R O _ U O M >   
          < / P O S E n t r y S a l e s L i n e s >   
-         < P O S E n t r y T a x L i n e s > - 
-             < C R O _ A m o u n t I n c l V A T > C R O _ A m o u n t I n c l V A T < / C R O _ A m o u n t I n c l V A T > - 
-             < C R O _ V A T A m o u n t > C R O _ V A T A m o u n t < / C R O _ V A T A m o u n t > - 
-             < C R O _ V A T B a s e A m o u n t > C R O _ V A T B a s e A m o u n t < / C R O _ V A T B a s e A m o u n t > - 
-             < C R O _ V A T P e r c > C R O _ V A T P e r c < / C R O _ V A T P e r c > +         < P O S E n t r y T a x L i n e s   E l e m e n t T y p e = " D a t a I t e m "   E l e m e n t I d = " 8 3 5 0 4 2 8 3 7 " > + 
+             < C R O _ A m o u n t I n c l V A T   E l e m e n t T y p e = " C o l u m n "   E l e m e n t I d = " 2 0 2 8 2 0 6 8 5 3 "   D a t a T y p e = " D e c i m a l " > C R O _ A m o u n t I n c l V A T < / C R O _ A m o u n t I n c l V A T > + 
+             < C R O _ V A T A m o u n t   E l e m e n t T y p e = " C o l u m n "   E l e m e n t I d = " 6 3 6 5 2 8 8 6 7 "   D a t a T y p e = " D e c i m a l " > C R O _ V A T A m o u n t < / C R O _ V A T A m o u n t > + 
+             < C R O _ V A T B a s e A m o u n t   E l e m e n t T y p e = " C o l u m n "   E l e m e n t I d = " 6 0 3 2 9 5 0 1 4 "   D a t a T y p e = " D e c i m a l " > C R O _ V A T B a s e A m o u n t < / C R O _ V A T B a s e A m o u n t > + 
+             < C R O _ V A T P e r c   E l e m e n t T y p e = " C o l u m n "   E l e m e n t I d = " 8 9 8 0 7 5 8 6 7 "   D a t a T y p e = " D e c i m a l " > C R O _ V A T P e r c < / C R O _ V A T P e r c >   
          < / P O S E n t r y T a x L i n e s >   
-         < P O S E n t r y P a y m e n t L i n e s > - 
-             < C R O _ A m o u n t > C R O _ A m o u n t < / C R O _ A m o u n t > - 
-             < C R O _ P a y m e n t _ D e s c r i p t i o n > C R O _ P a y m e n t _ D e s c r i p t i o n < / C R O _ P a y m e n t _ D e s c r i p t i o n > +         < P O S E n t r y P a y m e n t L i n e s   E l e m e n t T y p e = " D a t a I t e m "   E l e m e n t I d = " 1 2 3 5 6 5 7 8 7 8 " > + 
+             < C R O _ A m o u n t   E l e m e n t T y p e = " C o l u m n "   E l e m e n t I d = " 5 0 0 5 9 7 1 2 0 "   D a t a T y p e = " D e c i m a l " > C R O _ A m o u n t < / C R O _ A m o u n t > + 
+             < C R O _ P a y m e n t _ D e s c r i p t i o n   E l e m e n t T y p e = " C o l u m n "   E l e m e n t I d = " 1 6 3 9 9 1 3 9 3 "   D a t a T y p e = " T e x t " > C R O _ P a y m e n t _ D e s c r i p t i o n < / C R O _ P a y m e n t _ D e s c r i p t i o n >   
          < / P O S E n t r y P a y m e n t L i n e s >   
-         < C R O T o t a l s > - 
-             < C R O _ T o t a l V A T A m o u n t > C R O _ T o t a l V A T A m o u n t < / C R O _ T o t a l V A T A m o u n t > +         < C R O T o t a l s   E l e m e n t T y p e = " D a t a I t e m "   E l e m e n t I d = " 6 9 7 5 4 8 2 5 0 " > + 
+             < C R O _ T o t a l V A T A m o u n t   E l e m e n t T y p e = " C o l u m n "   E l e m e n t I d = " 1 2 4 7 7 1 0 4 6 3 "   D a t a T y p e = " D e c i m a l " > C R O _ T o t a l V A T A m o u n t < / C R O _ T o t a l V A T A m o u n t >   
          < / C R O T o t a l s >   
@@ -5063,7 +5189,9 @@
  < / N a v W o r d R e p o r t X m l P a r t > 
 </file>
 
-<file path=customXml/item2.xml>��< ? x m l   v e r s i o n = " 1 . 0 "   e n c o d i n g = " u t f - 1 6 " ? > < N a v W o r d R e p o r t X m l P a r t   x m l n s = " u r n : m i c r o s o f t - d y n a m i c s - b u s i n e s s c e n t r a l / i n t e r n a l / e x t e n d e d / r e p o r t s / N P R _ C R O _ F i s c a l _ B i l l _ A 4 / 6 0 1 4 5 5 4 / " > +<file path=customXml/item2.xml>��< ? x m l   v e r s i o n = " 1 . 0 "   e n c o d i n g = " u t f - 1 6 " ? > + 
+ < N a v W o r d R e p o r t X m l P a r t   x m l n s = " u r n : m i c r o s o f t - d y n a m i c s - n a v / r e p o r t s / N P R _ C R O _ F i s c a l _ B i l l _ A 4 / 6 0 1 4 5 5 4 / " >   
      < B C R e p o r t I n f o r m a t i o n >   
@@ -5131,141 +5259,141 @@
  
      < L a b e l s >   
-         < C u r r e n c y L b l   E l e m e n t T y p e = " P a r a m e t e r "   E l e m e n t I d = " 1 1 6 2 5 3 0 8 4 8 "   D a t a T y p e = " S t r i n g " > C u r r e n c y L b l < / C u r r e n c y L b l > - 
-         < D i s c o u n t L b l   E l e m e n t T y p e = " P a r a m e t e r "   E l e m e n t I d = " 2 9 0 6 6 1 1 1 8 "   D a t a T y p e = " S t r i n g " > D i s c o u n t L b l < / D i s c o u n t L b l > - 
-         < I t e m N a m e L b l   E l e m e n t T y p e = " P a r a m e t e r "   E l e m e n t I d = " 8 8 8 8 3 5 0 9 3 "   D a t a T y p e = " S t r i n g " > I t e m N a m e L b l < / I t e m N a m e L b l > - 
-         < I t e m N o L b l   E l e m e n t T y p e = " P a r a m e t e r "   E l e m e n t I d = " 1 7 9 0 6 2 1 1 1 5 "   D a t a T y p e = " S t r i n g " > I t e m N o L b l < / I t e m N o L b l > - 
-         < J I R L b l   E l e m e n t T y p e = " P a r a m e t e r "   E l e m e n t I d = " 1 8 9 2 1 0 9 9 3 4 "   D a t a T y p e = " S t r i n g " > J I R L b l < / J I R L b l > - 
-         < P a y m e n t M e t h o d L b l   E l e m e n t T y p e = " P a r a m e t e r "   E l e m e n t I d = " 2 0 6 0 2 7 8 2 7 4 "   D a t a T y p e = " S t r i n g " > P a y m e n t M e t h o d L b l < / P a y m e n t M e t h o d L b l > - 
-         < P e r c L b l   E l e m e n t T y p e = " P a r a m e t e r "   E l e m e n t I d = " 1 2 0 3 7 6 1 7 2 3 "   D a t a T y p e = " S t r i n g " > P e r c L b l < / P e r c L b l > - 
-         < P r i c e L b l   E l e m e n t T y p e = " P a r a m e t e r "   E l e m e n t I d = " 1 6 4 2 8 6 2 9 7 8 "   D a t a T y p e = " S t r i n g " > P r i c e L b l < / P r i c e L b l > - 
-         < Q t y L b l   E l e m e n t T y p e = " P a r a m e t e r "   E l e m e n t I d = " 1 1 1 2 3 4 7 3 2 3 "   D a t a T y p e = " S t r i n g " > Q t y L b l < / Q t y L b l > - 
-         < T a x A m o u n t L b l   E l e m e n t T y p e = " P a r a m e t e r "   E l e m e n t I d = " 2 1 2 1 8 8 1 8 5 8 "   D a t a T y p e = " S t r i n g " > T a x A m o u n t L b l < / T a x A m o u n t L b l > - 
-         < T a x B a s e L b l   E l e m e n t T y p e = " P a r a m e t e r "   E l e m e n t I d = " 1 7 2 5 1 6 4 1 9 1 "   D a t a T y p e = " S t r i n g " > T a x B a s e L b l < / T a x B a s e L b l > - 
-         < T a x L b l   E l e m e n t T y p e = " P a r a m e t e r "   E l e m e n t I d = " 3 2 0 6 8 2 1 1 0 "   D a t a T y p e = " S t r i n g " > T a x L b l < / T a x L b l > - 
-         < T a x R a t e L b l   E l e m e n t T y p e = " P a r a m e t e r "   E l e m e n t I d = " 1 2 1 0 7 0 0 5 4 4 "   D a t a T y p e = " S t r i n g " > T a x R a t e L b l < / T a x R a t e L b l > - 
-         < T o P a y L b l   E l e m e n t T y p e = " P a r a m e t e r "   E l e m e n t I d = " 1 3 4 8 2 0 8 9 8 8 "   D a t a T y p e = " S t r i n g " > T o P a y L b l < / T o P a y L b l > - 
-         < T o t a l L b l   E l e m e n t T y p e = " P a r a m e t e r "   E l e m e n t I d = " 2 6 2 6 5 4 8 3 7 "   D a t a T y p e = " S t r i n g " > T o t a l L b l < / T o t a l L b l > - 
-         < U o M L b l   E l e m e n t T y p e = " P a r a m e t e r "   E l e m e n t I d = " 7 3 6 2 1 6 7 6 0 "   D a t a T y p e = " S t r i n g " > U o M L b l < / U o M L b l > - 
-         < V A T L b l   E l e m e n t T y p e = " P a r a m e t e r "   E l e m e n t I d = " 4 7 0 2 7 2 7 4 8 "   D a t a T y p e = " S t r i n g " > V A T L b l < / V A T L b l > - 
-         < Z K I L b l   E l e m e n t T y p e = " P a r a m e t e r "   E l e m e n t I d = " 1 6 2 9 3 4 8 5 6 7 "   D a t a T y p e = " S t r i n g " > Z K I L b l < / Z K I L b l > +         < C u r r e n c y L b l > C u r r e n c y L b l < / C u r r e n c y L b l > + 
+         < D i s c o u n t L b l > D i s c o u n t L b l < / D i s c o u n t L b l > + 
+         < I t e m N a m e L b l > I t e m N a m e L b l < / I t e m N a m e L b l > + 
+         < I t e m N o L b l > I t e m N o L b l < / I t e m N o L b l > + 
+         < J I R L b l > J I R L b l < / J I R L b l > + 
+         < P a y m e n t M e t h o d L b l > P a y m e n t M e t h o d L b l < / P a y m e n t M e t h o d L b l > + 
+         < P e r c L b l > P e r c L b l < / P e r c L b l > + 
+         < P r i c e L b l > P r i c e L b l < / P r i c e L b l > + 
+         < Q t y L b l > Q t y L b l < / Q t y L b l > + 
+         < T a x A m o u n t L b l > T a x A m o u n t L b l < / T a x A m o u n t L b l > + 
+         < T a x B a s e L b l > T a x B a s e L b l < / T a x B a s e L b l > + 
+         < T a x L b l > T a x L b l < / T a x L b l > + 
+         < T a x R a t e L b l > T a x R a t e L b l < / T a x R a t e L b l > + 
+         < T o P a y L b l > T o P a y L b l < / T o P a y L b l > + 
+         < T o t a l L b l > T o t a l L b l < / T o t a l L b l > + 
+         < U o M L b l > U o M L b l < / U o M L b l > + 
+         < V A T L b l > V A T L b l < / V A T L b l > + 
+         < Z K I L b l > Z K I L b l < / Z K I L b l >   
      < / L a b e l s >   
-     < T o o l t i p s / > - 
-     < C o m p a n y I n f o r m a t i o n   E l e m e n t T y p e = " D a t a I t e m "   E l e m e n t I d = " 1 5 5 6 1 4 5 1 5 4 " > - 
-         < C R O _ C o m p a n y _ A d d r e s s   E l e m e n t T y p e = " C o l u m n "   E l e m e n t I d = " 1 3 6 7 8 4 5 4 0 2 "   D a t a T y p e = " T e x t " > C R O _ C o m p a n y _ A d d r e s s < / C R O _ C o m p a n y _ A d d r e s s > - 
-         < C R O _ C o m p a n y _ E m a i l   E l e m e n t T y p e = " C o l u m n "   E l e m e n t I d = " 4 1 8 7 6 7 8 3 2 "   D a t a T y p e = " T e x t " > C R O _ C o m p a n y _ E m a i l < / C R O _ C o m p a n y _ E m a i l > - 
-         < C R O _ C o m p a n y _ H o m e P a g e   E l e m e n t T y p e = " C o l u m n "   E l e m e n t I d = " 1 0 6 7 7 6 5 2 5 6 "   D a t a T y p e = " T e x t " > C R O _ C o m p a n y _ H o m e P a g e < / C R O _ C o m p a n y _ H o m e P a g e > - 
-         < C R O _ C o m p a n y _ I n f o r m a t i o n B l o c k   E l e m e n t T y p e = " C o l u m n "   E l e m e n t I d = " 1 8 3 7 7 9 1 6 5 5 "   D a t a T y p e = " T e x t " > C R O _ C o m p a n y _ I n f o r m a t i o n B l o c k < / C R O _ C o m p a n y _ I n f o r m a t i o n B l o c k > - 
-         < C R O _ C o m p a n y _ N a m e   E l e m e n t T y p e = " C o l u m n "   E l e m e n t I d = " 1 3 5 7 1 4 8 2 0 5 "   D a t a T y p e = " T e x t " > C R O _ C o m p a n y _ N a m e < / C R O _ C o m p a n y _ N a m e > - 
-         < C R O _ C o m p a n y _ P h o n e N o   E l e m e n t T y p e = " C o l u m n "   E l e m e n t I d = " 2 3 3 3 6 4 9 4 5 "   D a t a T y p e = " T e x t " > C R O _ C o m p a n y _ P h o n e N o < / C R O _ C o m p a n y _ P h o n e N o > - 
-         < C R O _ C o m p a n y _ P i c t u r e   E l e m e n t T y p e = " C o l u m n "   E l e m e n t I d = " 2 0 9 5 4 5 3 3 4 4 "   D a t a T y p e = " B l o b " / > - 
-         < C R O _ C o m p a n y _ V A T R e g N o   E l e m e n t T y p e = " C o l u m n "   E l e m e n t I d = " 6 3 9 2 3 8 4 4 6 "   D a t a T y p e = " T e x t " > C R O _ C o m p a n y _ V A T R e g N o < / C R O _ C o m p a n y _ V A T R e g N o > +     < C o m p a n y I n f o r m a t i o n > + 
+         < C R O _ C o m p a n y _ A d d r e s s > C R O _ C o m p a n y _ A d d r e s s < / C R O _ C o m p a n y _ A d d r e s s > + 
+         < C R O _ C o m p a n y _ E m a i l > C R O _ C o m p a n y _ E m a i l < / C R O _ C o m p a n y _ E m a i l > + 
+         < C R O _ C o m p a n y _ H o m e P a g e > C R O _ C o m p a n y _ H o m e P a g e < / C R O _ C o m p a n y _ H o m e P a g e > + 
+         < C R O _ C o m p a n y _ I n f o r m a t i o n B l o c k > C R O _ C o m p a n y _ I n f o r m a t i o n B l o c k < / C R O _ C o m p a n y _ I n f o r m a t i o n B l o c k > + 
+         < C R O _ C o m p a n y _ N a m e > C R O _ C o m p a n y _ N a m e < / C R O _ C o m p a n y _ N a m e > + 
+         < C R O _ C o m p a n y _ P h o n e N o > C R O _ C o m p a n y _ P h o n e N o < / C R O _ C o m p a n y _ P h o n e N o > + 
+         < C R O _ C o m p a n y _ P i c t u r e   / > + 
+         < C R O _ C o m p a n y _ V A T R e g N o > C R O _ C o m p a n y _ V A T R e g N o < / C R O _ C o m p a n y _ V A T R e g N o >   
      < / C o m p a n y I n f o r m a t i o n >   
-     < C R O P O S A u d i t L o g A u x I n f o   E l e m e n t T y p e = " D a t a I t e m "   E l e m e n t I d = " 1 6 9 9 8 0 1 3 2 " > - 
-         < C R O _ B i l l N o   E l e m e n t T y p e = " C o l u m n "   E l e m e n t I d = " 1 2 5 7 3 1 3 9 9 0 "   D a t a T y p e = " S t r i n g " > C R O _ B i l l N o < / C R O _ B i l l N o > - 
-         < C R O _ B i l l _ D a t e T i m e   E l e m e n t T y p e = " C o l u m n "   E l e m e n t I d = " 1 7 6 7 7 5 2 4 3 1 "   D a t a T y p e = " S t r i n g " > C R O _ B i l l _ D a t e T i m e < / C R O _ B i l l _ D a t e T i m e > - 
-         < C R O _ C o p y T e x t   E l e m e n t T y p e = " C o l u m n "   E l e m e n t I d = " 1 4 4 5 4 8 4 8 9 2 "   D a t a T y p e = " T e x t " > C R O _ C o p y T e x t < / C R O _ C o p y T e x t > - 
-         < C R O _ J I R C o d e   E l e m e n t T y p e = " C o l u m n "   E l e m e n t I d = " 7 0 5 7 1 4 1 9 2 "   D a t a T y p e = " T e x t " > C R O _ J I R C o d e < / C R O _ J I R C o d e > - 
-         < C R O _ Q R C o d e   E l e m e n t T y p e = " C o l u m n "   E l e m e n t I d = " 1 2 0 1 4 1 0 9 2 6 "   D a t a T y p e = " T e x t " > C R O _ Q R C o d e < / C R O _ Q R C o d e > - 
-         < C R O _ T o t a l A m o u n t   E l e m e n t T y p e = " C o l u m n "   E l e m e n t I d = " 1 1 5 3 9 3 8 3 8 6 "   D a t a T y p e = " D e c i m a l " > C R O _ T o t a l A m o u n t < / C R O _ T o t a l A m o u n t > - 
-         < C R O _ Z K I C o d e   E l e m e n t T y p e = " C o l u m n "   E l e m e n t I d = " 1 5 2 8 2 6 9 0 3 9 "   D a t a T y p e = " T e x t " > C R O _ Z K I C o d e < / C R O _ Z K I C o d e > - 
-         < C u s t o m e r   E l e m e n t T y p e = " D a t a I t e m "   E l e m e n t I d = " 1 5 2 5 1 9 1 9 9 " > - 
-             < C R O _ C u s t o m e r _ I n f o r m a t i o n B l o c k   E l e m e n t T y p e = " C o l u m n "   E l e m e n t I d = " 7 9 0 6 3 3 7 2 6 "   D a t a T y p e = " T e x t " > C R O _ C u s t o m e r _ I n f o r m a t i o n B l o c k < / C R O _ C u s t o m e r _ I n f o r m a t i o n B l o c k > +     < C R O P O S A u d i t L o g A u x I n f o > + 
+         < C R O _ B i l l N o > C R O _ B i l l N o < / C R O _ B i l l N o > + 
+         < C R O _ B i l l _ D a t e T i m e > C R O _ B i l l _ D a t e T i m e < / C R O _ B i l l _ D a t e T i m e > + 
+         < C R O _ C o p y T e x t > C R O _ C o p y T e x t < / C R O _ C o p y T e x t > + 
+         < C R O _ J I R C o d e > C R O _ J I R C o d e < / C R O _ J I R C o d e > + 
+         < C R O _ Q R C o d e > C R O _ Q R C o d e < / C R O _ Q R C o d e > + 
+         < C R O _ S o u r c e D o c u m e n t N o > C R O _ S o u r c e D o c u m e n t N o < / C R O _ S o u r c e D o c u m e n t N o > + 
+         < C R O _ T o t a l A m o u n t > C R O _ T o t a l A m o u n t < / C R O _ T o t a l A m o u n t > + 
+         < C R O _ Z K I C o d e > C R O _ Z K I C o d e < / C R O _ Z K I C o d e > + 
+         < C u s t o m e r > + 
+             < C R O _ C u s t o m e r _ I n f o r m a t i o n B l o c k > C R O _ C u s t o m e r _ I n f o r m a t i o n B l o c k < / C R O _ C u s t o m e r _ I n f o r m a t i o n B l o c k >   
          < / C u s t o m e r >   
-         < P O S S t o r e   E l e m e n t T y p e = " D a t a I t e m "   E l e m e n t I d = " 1 6 6 4 3 5 2 5 8 6 " > - 
-             < C R O _ P O S S t o r e _ A d d r e s s   E l e m e n t T y p e = " C o l u m n "   E l e m e n t I d = " 3 9 8 1 4 4 6 7 4 "   D a t a T y p e = " T e x t " > C R O _ P O S S t o r e _ A d d r e s s < / C R O _ P O S S t o r e _ A d d r e s s > - 
-             < C R O _ P O S S t o r e _ N a m e   E l e m e n t T y p e = " C o l u m n "   E l e m e n t I d = " 1 4 8 7 6 0 5 9 6 1 "   D a t a T y p e = " T e x t " > C R O _ P O S S t o r e _ N a m e < / C R O _ P O S S t o r e _ N a m e > +         < P O S S t o r e > + 
+             < C R O _ P O S S t o r e _ A d d r e s s > C R O _ P O S S t o r e _ A d d r e s s < / C R O _ P O S S t o r e _ A d d r e s s > + 
+             < C R O _ P O S S t o r e _ N a m e > C R O _ P O S S t o r e _ N a m e < / C R O _ P O S S t o r e _ N a m e >   
          < / P O S S t o r e >   
-         < P O S E n t r y S a l e s L i n e s   E l e m e n t T y p e = " D a t a I t e m "   E l e m e n t I d = " 9 6 3 7 9 4 9 6 8 " > - 
-             < C R O _ A m o u n t I n c l u d i n g V A T   E l e m e n t T y p e = " C o l u m n "   E l e m e n t I d = " 1 7 9 4 3 6 7 4 1 4 "   D a t a T y p e = " D e c i m a l " > C R O _ A m o u n t I n c l u d i n g V A T < / C R O _ A m o u n t I n c l u d i n g V A T > - 
-             < C R O _ D i s c o u n t A m o u n t   E l e m e n t T y p e = " C o l u m n "   E l e m e n t I d = " 1 7 5 3 9 4 0 8 7 5 "   D a t a T y p e = " T e x t " > C R O _ D i s c o u n t A m o u n t < / C R O _ D i s c o u n t A m o u n t > - 
-             < C R O _ D i s c o u n t P e r c   E l e m e n t T y p e = " C o l u m n "   E l e m e n t I d = " 1 9 9 6 4 9 6 9 7 9 "   D a t a T y p e = " T e x t " > C R O _ D i s c o u n t P e r c < / C R O _ D i s c o u n t P e r c > - 
-             < C R O _ I t e m D e s c r i p t i o n   E l e m e n t T y p e = " C o l u m n "   E l e m e n t I d = " 2 0 1 6 9 4 1 6 1 5 "   D a t a T y p e = " T e x t " > C R O _ I t e m D e s c r i p t i o n < / C R O _ I t e m D e s c r i p t i o n > - 
-             < C R O _ I t e m N o   E l e m e n t T y p e = " C o l u m n "   E l e m e n t I d = " 8 6 2 2 5 7 2 8 8 "   D a t a T y p e = " C o d e " > C R O _ I t e m N o < / C R O _ I t e m N o > - 
-             < C R O _ Q u a n t i t y   E l e m e n t T y p e = " C o l u m n "   E l e m e n t I d = " 3 5 0 4 0 5 5 9 9 "   D a t a T y p e = " D e c i m a l " > C R O _ Q u a n t i t y < / C R O _ Q u a n t i t y > - 
-             < C R O _ S a l e s p e r s o n N a m e   E l e m e n t T y p e = " C o l u m n "   E l e m e n t I d = " 7 8 2 1 4 0 2 9 8 "   D a t a T y p e = " T e x t " > C R O _ S a l e s p e r s o n N a m e < / C R O _ S a l e s p e r s o n N a m e > - 
-             < C R O _ U n i t P r i c e   E l e m e n t T y p e = " C o l u m n "   E l e m e n t I d = " 2 8 5 7 4 5 2 5 5 "   D a t a T y p e = " D e c i m a l " > C R O _ U n i t P r i c e < / C R O _ U n i t P r i c e > - 
-             < C R O _ U O M   E l e m e n t T y p e = " C o l u m n "   E l e m e n t I d = " 1 1 6 4 4 5 6 6 9 9 "   D a t a T y p e = " C o d e " > C R O _ U O M < / C R O _ U O M > +         < P O S E n t r y S a l e s L i n e s > + 
+             < C R O _ A m o u n t I n c l u d i n g V A T > C R O _ A m o u n t I n c l u d i n g V A T < / C R O _ A m o u n t I n c l u d i n g V A T > + 
+             < C R O _ D i s c o u n t A m o u n t > C R O _ D i s c o u n t A m o u n t < / C R O _ D i s c o u n t A m o u n t > + 
+             < C R O _ D i s c o u n t P e r c > C R O _ D i s c o u n t P e r c < / C R O _ D i s c o u n t P e r c > + 
+             < C R O _ I t e m D e s c r i p t i o n > C R O _ I t e m D e s c r i p t i o n < / C R O _ I t e m D e s c r i p t i o n > + 
+             < C R O _ I t e m N o > C R O _ I t e m N o < / C R O _ I t e m N o > + 
+             < C R O _ Q u a n t i t y > C R O _ Q u a n t i t y < / C R O _ Q u a n t i t y > + 
+             < C R O _ S a l e s p e r s o n N a m e > C R O _ S a l e s p e r s o n N a m e < / C R O _ S a l e s p e r s o n N a m e > + 
+             < C R O _ U n i t P r i c e > C R O _ U n i t P r i c e < / C R O _ U n i t P r i c e > + 
+             < C R O _ U O M > C R O _ U O M < / C R O _ U O M >   
          < / P O S E n t r y S a l e s L i n e s >   
-         < P O S E n t r y T a x L i n e s   E l e m e n t T y p e = " D a t a I t e m "   E l e m e n t I d = " 8 3 5 0 4 2 8 3 7 " > - 
-             < C R O _ A m o u n t I n c l V A T   E l e m e n t T y p e = " C o l u m n "   E l e m e n t I d = " 2 0 2 8 2 0 6 8 5 3 "   D a t a T y p e = " D e c i m a l " > C R O _ A m o u n t I n c l V A T < / C R O _ A m o u n t I n c l V A T > - 
-             < C R O _ V A T A m o u n t   E l e m e n t T y p e = " C o l u m n "   E l e m e n t I d = " 6 3 6 5 2 8 8 6 7 "   D a t a T y p e = " D e c i m a l " > C R O _ V A T A m o u n t < / C R O _ V A T A m o u n t > - 
-             < C R O _ V A T B a s e A m o u n t   E l e m e n t T y p e = " C o l u m n "   E l e m e n t I d = " 6 0 3 2 9 5 0 1 4 "   D a t a T y p e = " D e c i m a l " > C R O _ V A T B a s e A m o u n t < / C R O _ V A T B a s e A m o u n t > - 
-             < C R O _ V A T P e r c   E l e m e n t T y p e = " C o l u m n "   E l e m e n t I d = " 8 9 8 0 7 5 8 6 7 "   D a t a T y p e = " D e c i m a l " > C R O _ V A T P e r c < / C R O _ V A T P e r c > +         < P O S E n t r y T a x L i n e s > + 
+             < C R O _ A m o u n t I n c l V A T > C R O _ A m o u n t I n c l V A T < / C R O _ A m o u n t I n c l V A T > + 
+             < C R O _ V A T A m o u n t > C R O _ V A T A m o u n t < / C R O _ V A T A m o u n t > + 
+             < C R O _ V A T B a s e A m o u n t > C R O _ V A T B a s e A m o u n t < / C R O _ V A T B a s e A m o u n t > + 
+             < C R O _ V A T P e r c > C R O _ V A T P e r c < / C R O _ V A T P e r c >   
          < / P O S E n t r y T a x L i n e s >   
-         < P O S E n t r y P a y m e n t L i n e s   E l e m e n t T y p e = " D a t a I t e m "   E l e m e n t I d = " 1 2 3 5 6 5 7 8 7 8 " > - 
-             < C R O _ A m o u n t   E l e m e n t T y p e = " C o l u m n "   E l e m e n t I d = " 5 0 0 5 9 7 1 2 0 "   D a t a T y p e = " D e c i m a l " > C R O _ A m o u n t < / C R O _ A m o u n t > - 
-             < C R O _ P a y m e n t _ D e s c r i p t i o n   E l e m e n t T y p e = " C o l u m n "   E l e m e n t I d = " 1 6 3 9 9 1 3 9 3 "   D a t a T y p e = " S t r i n g " > C R O _ P a y m e n t _ D e s c r i p t i o n < / C R O _ P a y m e n t _ D e s c r i p t i o n > +         < P O S E n t r y P a y m e n t L i n e s > + 
+             < C R O _ A m o u n t > C R O _ A m o u n t < / C R O _ A m o u n t > + 
+             < C R O _ P a y m e n t _ D e s c r i p t i o n > C R O _ P a y m e n t _ D e s c r i p t i o n < / C R O _ P a y m e n t _ D e s c r i p t i o n >   
          < / P O S E n t r y P a y m e n t L i n e s >   
-         < C R O T o t a l s   E l e m e n t T y p e = " D a t a I t e m "   E l e m e n t I d = " 6 9 7 5 4 8 2 5 0 " > - 
-             < C R O _ T o t a l V A T A m o u n t   E l e m e n t T y p e = " C o l u m n "   E l e m e n t I d = " 1 2 4 7 7 1 0 4 6 3 "   D a t a T y p e = " D e c i m a l " > C R O _ T o t a l V A T A m o u n t < / C R O _ T o t a l V A T A m o u n t > +         < C R O T o t a l s > + 
+             < C R O _ T o t a l V A T A m o u n t > C R O _ T o t a l V A T A m o u n t < / C R O _ T o t a l V A T A m o u n t >   
          < / C R O T o t a l s >   
@@ -5275,17 +5403,17 @@
 </file>
 
 <file path=customXml/itemProps1.xml><?xml version="1.0" encoding="utf-8"?>
+<ds:datastoreItem xmlns:ds="http://schemas.openxmlformats.org/officeDocument/2006/customXml" ds:itemID="{08B3A26B-DDFB-441C-8F9C-40F6EE00344C}">
+  <ds:schemaRefs>
+    <ds:schemaRef ds:uri="urn:microsoft-dynamics-businesscentral/internal/extended/reports/NPR_CRO_Fiscal_Bill_A4/6014554/"/>
+  </ds:schemaRefs>
+</ds:datastoreItem>
+</file>
+
+<file path=customXml/itemProps2.xml><?xml version="1.0" encoding="utf-8"?>
 <ds:datastoreItem xmlns:ds="http://schemas.openxmlformats.org/officeDocument/2006/customXml" ds:itemID="{974C08F4-FF06-4D7D-A995-8F2136C1311A}">
   <ds:schemaRefs>
     <ds:schemaRef ds:uri="urn:microsoft-dynamics-nav/reports/NPR_CRO_Fiscal_Bill_A4/6014554/"/>
   </ds:schemaRefs>
 </ds:datastoreItem>
-</file>
-
-<file path=customXml/itemProps2.xml><?xml version="1.0" encoding="utf-8"?>
-<ds:datastoreItem xmlns:ds="http://schemas.openxmlformats.org/officeDocument/2006/customXml" ds:itemID="{08B3A26B-DDFB-441C-8F9C-40F6EE00344C}">
-  <ds:schemaRefs>
-    <ds:schemaRef ds:uri="urn:microsoft-dynamics-businesscentral/internal/extended/reports/NPR_CRO_Fiscal_Bill_A4/6014554/"/>
-  </ds:schemaRefs>
-</ds:datastoreItem>
 </file>
</xml_diff>